<commit_message>
docs: show page numbers on every manual page
</commit_message>
<xml_diff>
--- a/docs/user-manual.docx
+++ b/docs/user-manual.docx
@@ -3207,7 +3207,6 @@
       <w:pgSz w:w="11906" w:h="16838"/>
       <w:pgMar w:top="1134" w:right="1247" w:bottom="1134" w:left="1247" w:header="567" w:footer="567" w:gutter="0"/>
       <w:cols w:space="720"/>
-      <w:titlePg/>
       <w:docGrid w:linePitch="360"/>
     </w:sectPr>
   </w:body>
@@ -3221,6 +3220,9 @@
       <w:pStyle w:val="Footer"/>
       <w:jc w:val="center"/>
     </w:pPr>
+    <w:r>
+      <w:t xml:space="preserve">ページ </w:t>
+    </w:r>
     <w:fldSimple w:instr="PAGE">
       <w:r>
         <w:t>1</w:t>

</xml_diff>

<commit_message>
Add role-based PDF workflow comparisons and audit reports
</commit_message>
<xml_diff>
--- a/docs/user-manual.docx
+++ b/docs/user-manual.docx
@@ -26,12 +26,12 @@
     </w:p>
     <w:p>
       <w:r>
-        <w:t>対象ソフトウェアバージョン  0.1.0</w:t>
+        <w:t>対象ソフトウェアバージョン  0.2.0</w:t>
       </w:r>
     </w:p>
     <w:p>
       <w:r>
-        <w:t>文書の更新日  2026-10-16</w:t>
+        <w:t>文書の更新日  2026-10-26</w:t>
       </w:r>
     </w:p>
     <w:p>
@@ -62,7 +62,7 @@
             <w:color w:val="1F4E79"/>
             <w:u w:val="single"/>
           </w:rPr>
-          <w:t>1. 概要</w:t>
+          <w:t>1 このツールで確認すること</w:t>
         </w:r>
       </w:hyperlink>
     </w:p>
@@ -76,7 +76,7 @@
             <w:color w:val="1F4E79"/>
             <w:u w:val="single"/>
           </w:rPr>
-          <w:t>2. できること・できないこと</w:t>
+          <w:t>2 起動と準備</w:t>
         </w:r>
       </w:hyperlink>
     </w:p>
@@ -90,7 +90,7 @@
             <w:color w:val="1F4E79"/>
             <w:u w:val="single"/>
           </w:rPr>
-          <w:t>3. 起動する</w:t>
+          <w:t>3 PDFを役割別に指定する</w:t>
         </w:r>
       </w:hyperlink>
     </w:p>
@@ -104,7 +104,7 @@
             <w:color w:val="1F4E79"/>
             <w:u w:val="single"/>
           </w:rPr>
-          <w:t>4. PDFを追加し、基準を指定する</w:t>
+          <w:t>4 比較を実行して表を読む</w:t>
         </w:r>
       </w:hyperlink>
     </w:p>
@@ -118,7 +118,7 @@
             <w:color w:val="1F4E79"/>
             <w:u w:val="single"/>
           </w:rPr>
-          <w:t>5. 比較を開始・中止する</w:t>
+          <w:t>5 業務判定を読む</w:t>
         </w:r>
       </w:hyperlink>
     </w:p>
@@ -132,7 +132,7 @@
             <w:color w:val="1F4E79"/>
             <w:u w:val="single"/>
           </w:rPr>
-          <w:t>6. 結果一覧を読む</w:t>
+          <w:t>6 結果を保存する</w:t>
         </w:r>
       </w:hyperlink>
     </w:p>
@@ -146,7 +146,7 @@
             <w:color w:val="1F4E79"/>
             <w:u w:val="single"/>
           </w:rPr>
-          <w:t>7. 6種類の判定</w:t>
+          <w:t>7 コマンドラインを使う</w:t>
         </w:r>
       </w:hyperlink>
     </w:p>
@@ -160,7 +160,7 @@
             <w:color w:val="1F4E79"/>
             <w:u w:val="single"/>
           </w:rPr>
-          <w:t>8. 注釈の作成者名と件数</w:t>
+          <w:t>8 エラーや判定不能への対処</w:t>
         </w:r>
       </w:hyperlink>
     </w:p>
@@ -174,49 +174,7 @@
             <w:color w:val="1F4E79"/>
             <w:u w:val="single"/>
           </w:rPr>
-          <w:t>9. 結果を保存する</w:t>
-        </w:r>
-      </w:hyperlink>
-    </w:p>
-    <w:p>
-      <w:pPr>
-        <w:spacing w:after="140"/>
-      </w:pPr>
-      <w:hyperlink w:anchor="manual_ch_10">
-        <w:r>
-          <w:rPr>
-            <w:color w:val="1F4E79"/>
-            <w:u w:val="single"/>
-          </w:rPr>
-          <w:t>10. 原本の扱い</w:t>
-        </w:r>
-      </w:hyperlink>
-    </w:p>
-    <w:p>
-      <w:pPr>
-        <w:spacing w:after="140"/>
-      </w:pPr>
-      <w:hyperlink w:anchor="manual_ch_11">
-        <w:r>
-          <w:rPr>
-            <w:color w:val="1F4E79"/>
-            <w:u w:val="single"/>
-          </w:rPr>
-          <w:t>11. よくあるエラーと対処</w:t>
-        </w:r>
-      </w:hyperlink>
-    </w:p>
-    <w:p>
-      <w:pPr>
-        <w:spacing w:after="140"/>
-      </w:pPr>
-      <w:hyperlink w:anchor="manual_ch_12">
-        <w:r>
-          <w:rPr>
-            <w:color w:val="1F4E79"/>
-            <w:u w:val="single"/>
-          </w:rPr>
-          <w:t>12. よくある質問</w:t>
+          <w:t>9 比較の範囲と参考情報</w:t>
         </w:r>
       </w:hyperlink>
     </w:p>
@@ -227,45 +185,23 @@
     </w:p>
     <w:bookmarkStart w:id="900" w:name="manual_body_start"/>
     <w:p>
-      <w:r>
-        <w:t>画面はWindows 11上の実際のアプリを、自作サンプルPDFで操作した例です。ファイル名・記録名は説明用です。画面全体と部分拡大を併用しています。配置や表示の大きさは環境によって異なります。</w:t>
-      </w:r>
-    </w:p>
-    <w:p>
       <w:bookmarkStart w:id="1" w:name="manual_ch_1"/>
       <w:pPr>
         <w:pStyle w:val="Heading1"/>
       </w:pPr>
       <w:r>
-        <w:t>1. 概要</w:t>
+        <w:t>1 このツールで確認すること</w:t>
       </w:r>
       <w:bookmarkEnd w:id="1"/>
     </w:p>
     <w:p>
       <w:r>
-        <w:t>2～4個のPDFを指定し、1番目の基準PDFから内容が変わっていないかを調べるWindows向けのツールです。「PDF本体」「レイヤーなし」「各レイヤー」の判定を個別に表示します。基準PDFは利用者が選びます。</w:t>
+        <w:t>担当・確認・審査・承認のPDFを比較し、レイヤーごとの内容の一致状況と業務上のPASS・FAIL・UNVERIFIABLEを確認します。担当・確認は必須で、審査・承認はそれぞれ省略できます。基準PDFは、指定された最後の工程から自動選択されます。</w:t>
       </w:r>
     </w:p>
     <w:p>
       <w:r>
-        <w:t>本プログラムは、PDF本体・レイヤーなし・各OCGレイヤーの内容を比較する。オブジェクトの重なり順や視認性は判定しない。チェックマーク・注記の視認性や妥当性は、担当者・確認者・審査者が目視で確認する。</w:t>
-      </w:r>
-    </w:p>
-    <w:p>
-      <w:r>
-        <w:t>担当者等の役割は一般的な利用例です。本ツールを使うために特定の役割分担は必要ありません。初めて使う場合は、先に</w:t>
-      </w:r>
-      <w:hyperlink r:id="rId10">
-        <w:r>
-          <w:rPr>
-            <w:color w:val="1F4E79"/>
-            <w:u w:val="single"/>
-          </w:rPr>
-          <w:t>インストール・セットアップ手順書</w:t>
-        </w:r>
-      </w:hyperlink>
-      <w:r>
-        <w:t>でPythonとpypdfを準備してください。</w:t>
+        <w:t>比較は構造・内容を対象とします。原本PDFは変更しません。見た目や記載内容の正しさ、チェックマークの視認性は目視で確認してください。</w:t>
       </w:r>
     </w:p>
     <w:p>
@@ -274,348 +210,30 @@
         <w:pStyle w:val="Heading1"/>
       </w:pPr>
       <w:r>
-        <w:t>2. できること・できないこと</w:t>
+        <w:t>2 起動と準備</w:t>
       </w:r>
       <w:bookmarkEnd w:id="2"/>
     </w:p>
-    <w:tbl>
-      <w:tblPr>
-        <w:tblW w:type="auto" w:w="0"/>
-        <w:tblLayout w:type="fixed"/>
-        <w:tblLook w:firstColumn="1" w:firstRow="1" w:lastColumn="0" w:lastRow="0" w:noHBand="0" w:noVBand="1" w:val="04A0"/>
-        <w:tblBorders>
-          <w:top w:val="single" w:sz="4" w:color="D9D9D9"/>
-          <w:left w:val="single" w:sz="4" w:color="D9D9D9"/>
-          <w:bottom w:val="single" w:sz="4" w:color="D9D9D9"/>
-          <w:right w:val="single" w:sz="4" w:color="D9D9D9"/>
-          <w:insideH w:val="single" w:sz="4" w:color="D9D9D9"/>
-          <w:insideV w:val="single" w:sz="4" w:color="D9D9D9"/>
-        </w:tblBorders>
-      </w:tblPr>
-      <w:tblGrid>
-        <w:gridCol w:w="2948"/>
-        <w:gridCol w:w="6463"/>
-      </w:tblGrid>
-      <w:tr>
-        <w:trPr>
-          <w:cantSplit/>
-          <w:tblHeader/>
-        </w:trPr>
-        <w:tc>
-          <w:tcPr>
-            <w:tcW w:type="dxa" w:w="2948"/>
-            <w:vAlign w:val="center"/>
-            <w:tcMar>
-              <w:top w:w="80" w:type="dxa"/>
-              <w:left w:w="80" w:type="dxa"/>
-              <w:bottom w:w="80" w:type="dxa"/>
-              <w:right w:w="80" w:type="dxa"/>
-            </w:tcMar>
-            <w:shd w:fill="E8EFF6"/>
-          </w:tcPr>
-          <w:p>
-            <w:pPr>
-              <w:spacing w:after="40" w:before="40" w:line="276" w:lineRule="auto"/>
-            </w:pPr>
-            <w:r>
-              <w:rPr>
-                <w:b/>
-                <w:sz w:val="20"/>
-              </w:rPr>
-              <w:t>できること</w:t>
-            </w:r>
-          </w:p>
-        </w:tc>
-        <w:tc>
-          <w:tcPr>
-            <w:tcW w:type="dxa" w:w="6463"/>
-            <w:vAlign w:val="center"/>
-            <w:tcMar>
-              <w:top w:w="80" w:type="dxa"/>
-              <w:left w:w="80" w:type="dxa"/>
-              <w:bottom w:w="80" w:type="dxa"/>
-              <w:right w:w="80" w:type="dxa"/>
-            </w:tcMar>
-            <w:shd w:fill="E8EFF6"/>
-          </w:tcPr>
-          <w:p>
-            <w:pPr>
-              <w:spacing w:after="40" w:before="40" w:line="276" w:lineRule="auto"/>
-            </w:pPr>
-            <w:r>
-              <w:rPr>
-                <w:b/>
-                <w:sz w:val="20"/>
-              </w:rPr>
-              <w:t>内容</w:t>
-            </w:r>
-          </w:p>
-        </w:tc>
-      </w:tr>
-      <w:tr>
-        <w:trPr>
-          <w:cantSplit/>
-        </w:trPr>
-        <w:tc>
-          <w:tcPr>
-            <w:tcW w:type="dxa" w:w="2948"/>
-            <w:vAlign w:val="center"/>
-            <w:tcMar>
-              <w:top w:w="80" w:type="dxa"/>
-              <w:left w:w="80" w:type="dxa"/>
-              <w:bottom w:w="80" w:type="dxa"/>
-              <w:right w:w="80" w:type="dxa"/>
-            </w:tcMar>
-          </w:tcPr>
-          <w:p>
-            <w:pPr>
-              <w:spacing w:after="40" w:before="40" w:line="276" w:lineRule="auto"/>
-            </w:pPr>
-            <w:r>
-              <w:rPr>
-                <w:sz w:val="20"/>
-              </w:rPr>
-              <w:t>内容の変更を調べる</w:t>
-            </w:r>
-          </w:p>
-        </w:tc>
-        <w:tc>
-          <w:tcPr>
-            <w:tcW w:type="dxa" w:w="6463"/>
-            <w:vAlign w:val="center"/>
-            <w:tcMar>
-              <w:top w:w="80" w:type="dxa"/>
-              <w:left w:w="80" w:type="dxa"/>
-              <w:bottom w:w="80" w:type="dxa"/>
-              <w:right w:w="80" w:type="dxa"/>
-            </w:tcMar>
-          </w:tcPr>
-          <w:p>
-            <w:pPr>
-              <w:spacing w:after="40" w:before="40" w:line="276" w:lineRule="auto"/>
-            </w:pPr>
-            <w:r>
-              <w:rPr>
-                <w:sz w:val="20"/>
-              </w:rPr>
-              <w:t>対応する文字、図形、位置、大きさ、色、線幅、透明度、注釈や使用資源の差を検出します</w:t>
-            </w:r>
-          </w:p>
-        </w:tc>
-      </w:tr>
-      <w:tr>
-        <w:trPr>
-          <w:cantSplit/>
-        </w:trPr>
-        <w:tc>
-          <w:tcPr>
-            <w:tcW w:type="dxa" w:w="2948"/>
-            <w:vAlign w:val="center"/>
-            <w:tcMar>
-              <w:top w:w="80" w:type="dxa"/>
-              <w:left w:w="80" w:type="dxa"/>
-              <w:bottom w:w="80" w:type="dxa"/>
-              <w:right w:w="80" w:type="dxa"/>
-            </w:tcMar>
-          </w:tcPr>
-          <w:p>
-            <w:pPr>
-              <w:spacing w:after="40" w:before="40" w:line="276" w:lineRule="auto"/>
-            </w:pPr>
-            <w:r>
-              <w:rPr>
-                <w:sz w:val="20"/>
-              </w:rPr>
-              <w:t>グループ別に確認する</w:t>
-            </w:r>
-          </w:p>
-        </w:tc>
-        <w:tc>
-          <w:tcPr>
-            <w:tcW w:type="dxa" w:w="6463"/>
-            <w:vAlign w:val="center"/>
-            <w:tcMar>
-              <w:top w:w="80" w:type="dxa"/>
-              <w:left w:w="80" w:type="dxa"/>
-              <w:bottom w:w="80" w:type="dxa"/>
-              <w:right w:w="80" w:type="dxa"/>
-            </w:tcMar>
-          </w:tcPr>
-          <w:p>
-            <w:pPr>
-              <w:spacing w:after="40" w:before="40" w:line="276" w:lineRule="auto"/>
-            </w:pPr>
-            <w:r>
-              <w:rPr>
-                <w:sz w:val="20"/>
-              </w:rPr>
-              <w:t>変更のあるレイヤーと、維持されているレイヤーを別々に確認します</w:t>
-            </w:r>
-          </w:p>
-        </w:tc>
-      </w:tr>
-      <w:tr>
-        <w:trPr>
-          <w:cantSplit/>
-        </w:trPr>
-        <w:tc>
-          <w:tcPr>
-            <w:tcW w:type="dxa" w:w="2948"/>
-            <w:vAlign w:val="center"/>
-            <w:tcMar>
-              <w:top w:w="80" w:type="dxa"/>
-              <w:left w:w="80" w:type="dxa"/>
-              <w:bottom w:w="80" w:type="dxa"/>
-              <w:right w:w="80" w:type="dxa"/>
-            </w:tcMar>
-          </w:tcPr>
-          <w:p>
-            <w:pPr>
-              <w:spacing w:after="40" w:before="40" w:line="276" w:lineRule="auto"/>
-            </w:pPr>
-            <w:r>
-              <w:rPr>
-                <w:sz w:val="20"/>
-              </w:rPr>
-              <w:t>フォント差を区別する</w:t>
-            </w:r>
-          </w:p>
-        </w:tc>
-        <w:tc>
-          <w:tcPr>
-            <w:tcW w:type="dxa" w:w="6463"/>
-            <w:vAlign w:val="center"/>
-            <w:tcMar>
-              <w:top w:w="80" w:type="dxa"/>
-              <w:left w:w="80" w:type="dxa"/>
-              <w:bottom w:w="80" w:type="dxa"/>
-              <w:right w:w="80" w:type="dxa"/>
-            </w:tcMar>
-          </w:tcPr>
-          <w:p>
-            <w:pPr>
-              <w:spacing w:after="40" w:before="40" w:line="276" w:lineRule="auto"/>
-            </w:pPr>
-            <w:r>
-              <w:rPr>
-                <w:sz w:val="20"/>
-              </w:rPr>
-              <w:t>安全に文字と配置等を確認できる場合に、フォントだけの変更を区別します</w:t>
-            </w:r>
-          </w:p>
-        </w:tc>
-      </w:tr>
-      <w:tr>
-        <w:trPr>
-          <w:cantSplit/>
-        </w:trPr>
-        <w:tc>
-          <w:tcPr>
-            <w:tcW w:type="dxa" w:w="2948"/>
-            <w:vAlign w:val="center"/>
-            <w:tcMar>
-              <w:top w:w="80" w:type="dxa"/>
-              <w:left w:w="80" w:type="dxa"/>
-              <w:bottom w:w="80" w:type="dxa"/>
-              <w:right w:w="80" w:type="dxa"/>
-            </w:tcMar>
-          </w:tcPr>
-          <w:p>
-            <w:pPr>
-              <w:spacing w:after="40" w:before="40" w:line="276" w:lineRule="auto"/>
-            </w:pPr>
-            <w:r>
-              <w:rPr>
-                <w:sz w:val="20"/>
-              </w:rPr>
-              <w:t>作成者記録を参照する</w:t>
-            </w:r>
-          </w:p>
-        </w:tc>
-        <w:tc>
-          <w:tcPr>
-            <w:tcW w:type="dxa" w:w="6463"/>
-            <w:vAlign w:val="center"/>
-            <w:tcMar>
-              <w:top w:w="80" w:type="dxa"/>
-              <w:left w:w="80" w:type="dxa"/>
-              <w:bottom w:w="80" w:type="dxa"/>
-              <w:right w:w="80" w:type="dxa"/>
-            </w:tcMar>
-          </w:tcPr>
-          <w:p>
-            <w:pPr>
-              <w:spacing w:after="40" w:before="40" w:line="276" w:lineRule="auto"/>
-            </w:pPr>
-            <w:r>
-              <w:rPr>
-                <w:sz w:val="20"/>
-              </w:rPr>
-              <w:t>注釈に記録された名前と件数を内容判定とは別に表示します</w:t>
-            </w:r>
-          </w:p>
-        </w:tc>
-      </w:tr>
-      <w:tr>
-        <w:trPr>
-          <w:cantSplit/>
-        </w:trPr>
-        <w:tc>
-          <w:tcPr>
-            <w:tcW w:type="dxa" w:w="2948"/>
-            <w:vAlign w:val="center"/>
-            <w:tcMar>
-              <w:top w:w="80" w:type="dxa"/>
-              <w:left w:w="80" w:type="dxa"/>
-              <w:bottom w:w="80" w:type="dxa"/>
-              <w:right w:w="80" w:type="dxa"/>
-            </w:tcMar>
-          </w:tcPr>
-          <w:p>
-            <w:pPr>
-              <w:spacing w:after="40" w:before="40" w:line="276" w:lineRule="auto"/>
-            </w:pPr>
-            <w:r>
-              <w:rPr>
-                <w:sz w:val="20"/>
-              </w:rPr>
-              <w:t>結果を保存する</w:t>
-            </w:r>
-          </w:p>
-        </w:tc>
-        <w:tc>
-          <w:tcPr>
-            <w:tcW w:type="dxa" w:w="6463"/>
-            <w:vAlign w:val="center"/>
-            <w:tcMar>
-              <w:top w:w="80" w:type="dxa"/>
-              <w:left w:w="80" w:type="dxa"/>
-              <w:bottom w:w="80" w:type="dxa"/>
-              <w:right w:w="80" w:type="dxa"/>
-            </w:tcMar>
-          </w:tcPr>
-          <w:p>
-            <w:pPr>
-              <w:spacing w:after="40" w:before="40" w:line="276" w:lineRule="auto"/>
-            </w:pPr>
-            <w:r>
-              <w:rPr>
-                <w:sz w:val="20"/>
-              </w:rPr>
-              <w:t>TXT・CSV・JSONへ保存します</w:t>
-            </w:r>
-          </w:p>
-        </w:tc>
-      </w:tr>
-    </w:tbl>
     <w:p>
-      <w:pPr>
-        <w:spacing w:after="40"/>
-      </w:pPr>
+      <w:r>
+        <w:t>通常インストール済みのPython 3.14と、vendorへ配置したpypdf 6.20.1を使用します。start.batを起動すると画面が開きます。初期準備は</w:t>
+      </w:r>
+      <w:hyperlink r:id="rId10">
+        <w:r>
+          <w:rPr>
+            <w:color w:val="1F4E79"/>
+            <w:u w:val="single"/>
+          </w:rPr>
+          <w:t>インストール手順書</w:t>
+        </w:r>
+      </w:hyperlink>
+      <w:r>
+        <w:t>を参照してください。実行時のダウンロード・pip・仮想環境作成はありません。</w:t>
+      </w:r>
     </w:p>
     <w:p>
       <w:r>
-        <w:t>PDFの表示・編集、注釈の修正、記入内容の正しさや読みやすさの判断、操作者の認証は行いません。全PDFに対応するものではなく、同じPDF同士でも未対応構造があれば「検証不能」になります。</w:t>
+        <w:t>PDF保存にはReportLab・Pillow・charset-normalizerと日本語TrueTypeフォントも必要です。通常のWindowsではMSゴシックを使用します。依存の配置方法と任意フォントの指定は、インストール手順書のPDF出力の章を参照してください。</w:t>
       </w:r>
     </w:p>
     <w:p>
@@ -624,291 +242,13 @@
         <w:pStyle w:val="Heading1"/>
       </w:pPr>
       <w:r>
-        <w:t>3. 起動する</w:t>
+        <w:t>3 PDFを役割別に指定する</w:t>
       </w:r>
       <w:bookmarkEnd w:id="3"/>
     </w:p>
     <w:p>
       <w:r>
-        <w:t>ツールのフォルダーにある</w:t>
-      </w:r>
-      <w:r>
-        <w:rPr>
-          <w:rFonts w:ascii="Consolas" w:hAnsi="Consolas"/>
-        </w:rPr>
-        <w:t>start.bat</w:t>
-      </w:r>
-      <w:r>
-        <w:t>をダブルクリックします。通常のインストール済みPythonと、手動配置したpypdfを確認して画面が開きます。venv作成、pip操作、インターネット接続は不要です。setup.batはありません。</w:t>
-      </w:r>
-    </w:p>
-    <w:p>
-      <w:r>
-        <w:t>起動前には、通常のPython 3.14.8 64bitとTcl/Tk・Tkinterを準備します。ツールのmain.pyとstart.batがあるフォルダーにvendorを作り、pypdf 6.20.1のソースZIPにある</w:t>
-      </w:r>
-      <w:r>
-        <w:rPr>
-          <w:b/>
-        </w:rPr>
-        <w:t>内側のpypdfフォルダー全体</w:t>
-      </w:r>
-      <w:r>
-        <w:t>を</w:t>
-      </w:r>
-      <w:r>
-        <w:rPr>
-          <w:rFonts w:ascii="Consolas" w:hAnsi="Consolas"/>
-        </w:rPr>
-        <w:t>vendor/pypdf</w:t>
-      </w:r>
-      <w:r>
-        <w:t>へコピーしてください。同じZIPのLICENSEは</w:t>
-      </w:r>
-      <w:r>
-        <w:rPr>
-          <w:rFonts w:ascii="Consolas" w:hAnsi="Consolas"/>
-        </w:rPr>
-        <w:t>vendor/pypdf-LICENSE.txt</w:t>
-      </w:r>
-      <w:r>
-        <w:t>へコピーします。オンライン側ではソースZIPを取得するだけで、プログラムの実行は不要です。ZIPはオフライン側で手動展開します。</w:t>
-      </w:r>
-    </w:p>
-    <w:p>
-      <w:r>
-        <w:t>コマンドプロンプトでツールのフォルダーへ移動し、次のコマンドで環境を確認できます。「環境確認 OK」が出たら、start.batを起動して画面が開くことも確認してください。</w:t>
-      </w:r>
-    </w:p>
-    <w:p>
-      <w:pPr>
-        <w:keepLines/>
-      </w:pPr>
-      <w:r>
-        <w:rPr>
-          <w:rFonts w:ascii="Consolas" w:hAnsi="Consolas"/>
-          <w:sz w:val="20"/>
-        </w:rPr>
-        <w:t>start.bat --check</w:t>
-      </w:r>
-    </w:p>
-    <w:p>
-      <w:r>
-        <w:t>画面が開かない場合は、表示されたエラーを確認してください。環境だけを確認する方法は</w:t>
-      </w:r>
-      <w:hyperlink r:id="rId11">
-        <w:r>
-          <w:rPr>
-            <w:color w:val="1F4E79"/>
-            <w:u w:val="single"/>
-          </w:rPr>
-          <w:t>導入手順の環境確認</w:t>
-        </w:r>
-      </w:hyperlink>
-      <w:r>
-        <w:t>を参照してください。エラーで止まったとき、pypdfの配置を省略して起動することはできません。</w:t>
-      </w:r>
-    </w:p>
-    <w:p>
-      <w:pPr>
-        <w:keepNext/>
-        <w:keepLines/>
-        <w:jc w:val="center"/>
-      </w:pPr>
-      <w:r>
-        <w:drawing>
-          <wp:inline xmlns:a="http://schemas.openxmlformats.org/drawingml/2006/main" xmlns:pic="http://schemas.openxmlformats.org/drawingml/2006/picture">
-            <wp:extent cx="5510000" cy="3960000"/>
-            <wp:docPr id="1" name="Picture 1" descr="起動直後のメイン画面"/>
-            <wp:cNvGraphicFramePr>
-              <a:graphicFrameLocks noChangeAspect="1"/>
-            </wp:cNvGraphicFramePr>
-            <a:graphic>
-              <a:graphicData uri="http://schemas.openxmlformats.org/drawingml/2006/picture">
-                <pic:pic>
-                  <pic:nvPicPr>
-                    <pic:cNvPr id="0" name="main-window.png"/>
-                    <pic:cNvPicPr/>
-                  </pic:nvPicPr>
-                  <pic:blipFill>
-                    <a:blip r:embed="rId12"/>
-                    <a:stretch>
-                      <a:fillRect/>
-                    </a:stretch>
-                  </pic:blipFill>
-                  <pic:spPr>
-                    <a:xfrm>
-                      <a:off x="0" y="0"/>
-                      <a:ext cx="5510000" cy="3960000"/>
-                    </a:xfrm>
-                    <a:prstGeom prst="rect"/>
-                  </pic:spPr>
-                </pic:pic>
-              </a:graphicData>
-            </a:graphic>
-          </wp:inline>
-        </w:drawing>
-      </w:r>
-    </w:p>
-    <w:p>
-      <w:pPr>
-        <w:pStyle w:val="Caption"/>
-        <w:keepLines/>
-      </w:pPr>
-      <w:r>
-        <w:t>図1 起動直後のメイン画面：上側に入力一覧と操作ボタン、中央に結果一覧、下側に詳細欄があります。</w:t>
-      </w:r>
-    </w:p>
-    <w:p>
-      <w:bookmarkStart w:id="4" w:name="manual_ch_4"/>
-      <w:pPr>
-        <w:pStyle w:val="Heading1"/>
-      </w:pPr>
-      <w:r>
-        <w:t>4. PDFを追加し、基準を指定する</w:t>
-      </w:r>
-      <w:bookmarkEnd w:id="4"/>
-    </w:p>
-    <w:p>
-      <w:pPr>
-        <w:pStyle w:val="ListNumber"/>
-        <w:numPr>
-          <w:ilvl w:val="0"/>
-          <w:numId w:val="10"/>
-        </w:numPr>
-      </w:pPr>
-      <w:r>
-        <w:t>「PDF を追加」を押し、比較するPDFを選びます。合計2～4個を追加してください。</w:t>
-      </w:r>
-    </w:p>
-    <w:p>
-      <w:pPr>
-        <w:pStyle w:val="ListNumber"/>
-        <w:numPr>
-          <w:ilvl w:val="0"/>
-          <w:numId w:val="10"/>
-        </w:numPr>
-      </w:pPr>
-      <w:r>
-        <w:t>入力一覧のフルパスを確認します。1番目には「基準PDF」、残りには「比較対象」が表示されます。</w:t>
-      </w:r>
-    </w:p>
-    <w:p>
-      <w:pPr>
-        <w:pStyle w:val="ListNumber"/>
-        <w:numPr>
-          <w:ilvl w:val="0"/>
-          <w:numId w:val="10"/>
-        </w:numPr>
-      </w:pPr>
-      <w:r>
-        <w:t>順序を変える場合は1個選び、「上へ」「下へ」を押します。必ず、基準にしたいPDFを1番目にしてください。</w:t>
-      </w:r>
-    </w:p>
-    <w:p>
-      <w:pPr>
-        <w:pStyle w:val="ListNumber"/>
-        <w:numPr>
-          <w:ilvl w:val="0"/>
-          <w:numId w:val="10"/>
-        </w:numPr>
-      </w:pPr>
-      <w:r>
-        <w:t>不要な項目は選んで「選択を削除」を押します。削除されるのは一覧の項目で、ディスク上のPDFは削除されません。</w:t>
-      </w:r>
-    </w:p>
-    <w:p>
-      <w:r>
-        <w:t>例えば3個を入力した場合は、「1番目対2番目」と「1番目対3番目」の2組を比較します。2番目と3番目は直接比較しません。同じPDFを2回指定することもできます。入力を変更すると、前回の結果は消え、再比較が必要になります。</w:t>
-      </w:r>
-    </w:p>
-    <w:p>
-      <w:pPr>
-        <w:keepNext/>
-        <w:keepLines/>
-        <w:jc w:val="center"/>
-      </w:pPr>
-      <w:r>
-        <w:drawing>
-          <wp:inline xmlns:a="http://schemas.openxmlformats.org/drawingml/2006/main" xmlns:pic="http://schemas.openxmlformats.org/drawingml/2006/picture">
-            <wp:extent cx="5976000" cy="1528110"/>
-            <wp:docPr id="2" name="Picture 2" descr="PDFを3ファイル指定した入力欄"/>
-            <wp:cNvGraphicFramePr>
-              <a:graphicFrameLocks noChangeAspect="1"/>
-            </wp:cNvGraphicFramePr>
-            <a:graphic>
-              <a:graphicData uri="http://schemas.openxmlformats.org/drawingml/2006/picture">
-                <pic:pic>
-                  <pic:nvPicPr>
-                    <pic:cNvPr id="0" name="pdf-selection.png"/>
-                    <pic:cNvPicPr/>
-                  </pic:nvPicPr>
-                  <pic:blipFill>
-                    <a:blip r:embed="rId13"/>
-                    <a:stretch>
-                      <a:fillRect/>
-                    </a:stretch>
-                  </pic:blipFill>
-                  <pic:spPr>
-                    <a:xfrm>
-                      <a:off x="0" y="0"/>
-                      <a:ext cx="5976000" cy="1528110"/>
-                    </a:xfrm>
-                    <a:prstGeom prst="rect"/>
-                  </pic:spPr>
-                </pic:pic>
-              </a:graphicData>
-            </a:graphic>
-          </wp:inline>
-        </w:drawing>
-      </w:r>
-    </w:p>
-    <w:p>
-      <w:pPr>
-        <w:pStyle w:val="Caption"/>
-        <w:keepLines/>
-      </w:pPr>
-      <w:r>
-        <w:t>図2 基準PDFと比較対象の指定：reference.pdfが基準、checked-a.pdfとchecked-b.pdfが比較対象です。1個選択し、「上へ」「下へ」で順序を変更できます。</w:t>
-      </w:r>
-    </w:p>
-    <w:p>
-      <w:bookmarkStart w:id="5" w:name="manual_ch_5"/>
-      <w:pPr>
-        <w:pStyle w:val="Heading1"/>
-      </w:pPr>
-      <w:r>
-        <w:t>5. 比較を開始・中止する</w:t>
-      </w:r>
-      <w:bookmarkEnd w:id="5"/>
-    </w:p>
-    <w:p>
-      <w:r>
-        <w:t>「比較開始」を押します。処理中は入力変更ができません。進行表示は動作中を示し、完了率や残り時間を示すものではありません。</w:t>
-      </w:r>
-    </w:p>
-    <w:p>
-      <w:r>
-        <w:t>中止する場合は「中止」を押します。処理が止まり、「中止しました。判定結果はありません。」と表示されます。再実行する場合は「比較開始」を押してください。画面を閉じた場合も実行中の比較を停止します。</w:t>
-      </w:r>
-    </w:p>
-    <w:p>
-      <w:r>
-        <w:t>GUIの比較処理には、全比較対象を含めて180秒の待機上限があります。時間超過や処理失敗の場合は状態表示・詳細を確認してください。その回の判定結果は得られていません。ファイル数を減らす場合は、同じ基準との組を保って分けて比較してください。安全性のための制限を解除して一致にすることはできません。</w:t>
-      </w:r>
-    </w:p>
-    <w:p>
-      <w:bookmarkStart w:id="6" w:name="manual_ch_6"/>
-      <w:pPr>
-        <w:pStyle w:val="Heading1"/>
-      </w:pPr>
-      <w:r>
-        <w:t>6. 結果一覧を読む</w:t>
-      </w:r>
-      <w:bookmarkEnd w:id="6"/>
-    </w:p>
-    <w:p>
-      <w:r>
-        <w:t>一覧の列は「基準PDF」「比較対象PDF」「対象」「判定」です。比較組ごとにグループ別の行を表示します。行を選ぶと、下の詳細欄にファイルのフルパス、内容判定、差の説明や検証不能の理由、作成者の参考情報が表示されます。</w:t>
+        <w:t>各欄の「選択」でPDFを指定します。「解除」でその役割の指定を外せます。フルパスを直接入力することもできます。</w:t>
       </w:r>
     </w:p>
     <w:tbl>
@@ -955,7 +295,7 @@
                 <w:b/>
                 <w:sz w:val="20"/>
               </w:rPr>
-              <w:t>対象</w:t>
+              <w:t>役割</w:t>
             </w:r>
           </w:p>
         </w:tc>
@@ -980,7 +320,372 @@
                 <w:b/>
                 <w:sz w:val="20"/>
               </w:rPr>
-              <w:t>意味</w:t>
+              <w:t>指定条件</w:t>
+            </w:r>
+          </w:p>
+        </w:tc>
+      </w:tr>
+      <w:tr>
+        <w:trPr>
+          <w:cantSplit/>
+        </w:trPr>
+        <w:tc>
+          <w:tcPr>
+            <w:tcW w:type="dxa" w:w="2948"/>
+            <w:vAlign w:val="center"/>
+            <w:tcMar>
+              <w:top w:w="80" w:type="dxa"/>
+              <w:left w:w="80" w:type="dxa"/>
+              <w:bottom w:w="80" w:type="dxa"/>
+              <w:right w:w="80" w:type="dxa"/>
+            </w:tcMar>
+          </w:tcPr>
+          <w:p>
+            <w:pPr>
+              <w:spacing w:after="40" w:before="40" w:line="276" w:lineRule="auto"/>
+            </w:pPr>
+            <w:r>
+              <w:rPr>
+                <w:sz w:val="20"/>
+              </w:rPr>
+              <w:t>担当</w:t>
+            </w:r>
+          </w:p>
+        </w:tc>
+        <w:tc>
+          <w:tcPr>
+            <w:tcW w:type="dxa" w:w="6463"/>
+            <w:vAlign w:val="center"/>
+            <w:tcMar>
+              <w:top w:w="80" w:type="dxa"/>
+              <w:left w:w="80" w:type="dxa"/>
+              <w:bottom w:w="80" w:type="dxa"/>
+              <w:right w:w="80" w:type="dxa"/>
+            </w:tcMar>
+          </w:tcPr>
+          <w:p>
+            <w:pPr>
+              <w:spacing w:after="40" w:before="40" w:line="276" w:lineRule="auto"/>
+            </w:pPr>
+            <w:r>
+              <w:rPr>
+                <w:sz w:val="20"/>
+              </w:rPr>
+              <w:t>必須</w:t>
+            </w:r>
+          </w:p>
+        </w:tc>
+      </w:tr>
+      <w:tr>
+        <w:trPr>
+          <w:cantSplit/>
+        </w:trPr>
+        <w:tc>
+          <w:tcPr>
+            <w:tcW w:type="dxa" w:w="2948"/>
+            <w:vAlign w:val="center"/>
+            <w:tcMar>
+              <w:top w:w="80" w:type="dxa"/>
+              <w:left w:w="80" w:type="dxa"/>
+              <w:bottom w:w="80" w:type="dxa"/>
+              <w:right w:w="80" w:type="dxa"/>
+            </w:tcMar>
+          </w:tcPr>
+          <w:p>
+            <w:pPr>
+              <w:spacing w:after="40" w:before="40" w:line="276" w:lineRule="auto"/>
+            </w:pPr>
+            <w:r>
+              <w:rPr>
+                <w:sz w:val="20"/>
+              </w:rPr>
+              <w:t>確認</w:t>
+            </w:r>
+          </w:p>
+        </w:tc>
+        <w:tc>
+          <w:tcPr>
+            <w:tcW w:type="dxa" w:w="6463"/>
+            <w:vAlign w:val="center"/>
+            <w:tcMar>
+              <w:top w:w="80" w:type="dxa"/>
+              <w:left w:w="80" w:type="dxa"/>
+              <w:bottom w:w="80" w:type="dxa"/>
+              <w:right w:w="80" w:type="dxa"/>
+            </w:tcMar>
+          </w:tcPr>
+          <w:p>
+            <w:pPr>
+              <w:spacing w:after="40" w:before="40" w:line="276" w:lineRule="auto"/>
+            </w:pPr>
+            <w:r>
+              <w:rPr>
+                <w:sz w:val="20"/>
+              </w:rPr>
+              <w:t>必須</w:t>
+            </w:r>
+          </w:p>
+        </w:tc>
+      </w:tr>
+      <w:tr>
+        <w:trPr>
+          <w:cantSplit/>
+        </w:trPr>
+        <w:tc>
+          <w:tcPr>
+            <w:tcW w:type="dxa" w:w="2948"/>
+            <w:vAlign w:val="center"/>
+            <w:tcMar>
+              <w:top w:w="80" w:type="dxa"/>
+              <w:left w:w="80" w:type="dxa"/>
+              <w:bottom w:w="80" w:type="dxa"/>
+              <w:right w:w="80" w:type="dxa"/>
+            </w:tcMar>
+          </w:tcPr>
+          <w:p>
+            <w:pPr>
+              <w:spacing w:after="40" w:before="40" w:line="276" w:lineRule="auto"/>
+            </w:pPr>
+            <w:r>
+              <w:rPr>
+                <w:sz w:val="20"/>
+              </w:rPr>
+              <w:t>審査</w:t>
+            </w:r>
+          </w:p>
+        </w:tc>
+        <w:tc>
+          <w:tcPr>
+            <w:tcW w:type="dxa" w:w="6463"/>
+            <w:vAlign w:val="center"/>
+            <w:tcMar>
+              <w:top w:w="80" w:type="dxa"/>
+              <w:left w:w="80" w:type="dxa"/>
+              <w:bottom w:w="80" w:type="dxa"/>
+              <w:right w:w="80" w:type="dxa"/>
+            </w:tcMar>
+          </w:tcPr>
+          <w:p>
+            <w:pPr>
+              <w:spacing w:after="40" w:before="40" w:line="276" w:lineRule="auto"/>
+            </w:pPr>
+            <w:r>
+              <w:rPr>
+                <w:sz w:val="20"/>
+              </w:rPr>
+              <w:t>任意</w:t>
+            </w:r>
+          </w:p>
+        </w:tc>
+      </w:tr>
+      <w:tr>
+        <w:trPr>
+          <w:cantSplit/>
+        </w:trPr>
+        <w:tc>
+          <w:tcPr>
+            <w:tcW w:type="dxa" w:w="2948"/>
+            <w:vAlign w:val="center"/>
+            <w:tcMar>
+              <w:top w:w="80" w:type="dxa"/>
+              <w:left w:w="80" w:type="dxa"/>
+              <w:bottom w:w="80" w:type="dxa"/>
+              <w:right w:w="80" w:type="dxa"/>
+            </w:tcMar>
+          </w:tcPr>
+          <w:p>
+            <w:pPr>
+              <w:spacing w:after="40" w:before="40" w:line="276" w:lineRule="auto"/>
+            </w:pPr>
+            <w:r>
+              <w:rPr>
+                <w:sz w:val="20"/>
+              </w:rPr>
+              <w:t>承認</w:t>
+            </w:r>
+          </w:p>
+        </w:tc>
+        <w:tc>
+          <w:tcPr>
+            <w:tcW w:type="dxa" w:w="6463"/>
+            <w:vAlign w:val="center"/>
+            <w:tcMar>
+              <w:top w:w="80" w:type="dxa"/>
+              <w:left w:w="80" w:type="dxa"/>
+              <w:bottom w:w="80" w:type="dxa"/>
+              <w:right w:w="80" w:type="dxa"/>
+            </w:tcMar>
+          </w:tcPr>
+          <w:p>
+            <w:pPr>
+              <w:spacing w:after="40" w:before="40" w:line="276" w:lineRule="auto"/>
+            </w:pPr>
+            <w:r>
+              <w:rPr>
+                <w:sz w:val="20"/>
+              </w:rPr>
+              <w:t>任意</w:t>
+            </w:r>
+          </w:p>
+        </w:tc>
+      </w:tr>
+    </w:tbl>
+    <w:p>
+      <w:pPr>
+        <w:spacing w:after="40"/>
+      </w:pPr>
+    </w:p>
+    <w:p>
+      <w:r>
+        <w:t>すべて指定すると承認が基準です。承認を省略すると審査、審査と承認の両方を省略すると確認が基準です。審査を省略し、承認を指定することもできます。画面の基準PDF表示で確認してください。</w:t>
+      </w:r>
+    </w:p>
+    <w:p>
+      <w:r>
+        <w:t>業務レイヤー名は「担当」「確認」「審査」「承認」に完全一致させます。「担当者」等の別名や余分な空白を、自動的に同じ名前とは扱いません。同じPDFを複数の役割に指定することはできます。</w:t>
+      </w:r>
+    </w:p>
+    <w:p>
+      <w:bookmarkStart w:id="4" w:name="manual_ch_4"/>
+      <w:pPr>
+        <w:pStyle w:val="Heading1"/>
+      </w:pPr>
+      <w:r>
+        <w:t>4 比較を実行して表を読む</w:t>
+      </w:r>
+      <w:bookmarkEnd w:id="4"/>
+    </w:p>
+    <w:p>
+      <w:r>
+        <w:t>「比較開始」を押します。2ファイルなら1組、3ファイルなら3組、4ファイルなら6組を比較します。処理中は入力を変更できません。「中止」で処理を止めると判定結果は残りません。GUIの比較待機上限は180秒です。</w:t>
+      </w:r>
+    </w:p>
+    <w:p>
+      <w:r>
+        <w:t>「基準PDFとの比較」タブは、基準PDFのレイヤーを縦軸、各役割のPDFを横軸にした表です。各セルはそのPDFと基準との比較です。基準欄の「基準」は、自己一致を検証した意味ではありません。</w:t>
+      </w:r>
+    </w:p>
+    <w:tbl>
+      <w:tblPr>
+        <w:tblW w:type="auto" w:w="0"/>
+        <w:tblLayout w:type="fixed"/>
+        <w:tblLook w:firstColumn="1" w:firstRow="1" w:lastColumn="0" w:lastRow="0" w:noHBand="0" w:noVBand="1" w:val="04A0"/>
+        <w:tblBorders>
+          <w:top w:val="single" w:sz="4" w:color="D9D9D9"/>
+          <w:left w:val="single" w:sz="4" w:color="D9D9D9"/>
+          <w:bottom w:val="single" w:sz="4" w:color="D9D9D9"/>
+          <w:right w:val="single" w:sz="4" w:color="D9D9D9"/>
+          <w:insideH w:val="single" w:sz="4" w:color="D9D9D9"/>
+          <w:insideV w:val="single" w:sz="4" w:color="D9D9D9"/>
+        </w:tblBorders>
+      </w:tblPr>
+      <w:tblGrid>
+        <w:gridCol w:w="2948"/>
+        <w:gridCol w:w="6463"/>
+      </w:tblGrid>
+      <w:tr>
+        <w:trPr>
+          <w:cantSplit/>
+          <w:tblHeader/>
+        </w:trPr>
+        <w:tc>
+          <w:tcPr>
+            <w:tcW w:type="dxa" w:w="2948"/>
+            <w:vAlign w:val="center"/>
+            <w:tcMar>
+              <w:top w:w="80" w:type="dxa"/>
+              <w:left w:w="80" w:type="dxa"/>
+              <w:bottom w:w="80" w:type="dxa"/>
+              <w:right w:w="80" w:type="dxa"/>
+            </w:tcMar>
+            <w:shd w:fill="E8EFF6"/>
+          </w:tcPr>
+          <w:p>
+            <w:pPr>
+              <w:spacing w:after="40" w:before="40" w:line="276" w:lineRule="auto"/>
+            </w:pPr>
+            <w:r>
+              <w:rPr>
+                <w:b/>
+                <w:sz w:val="20"/>
+              </w:rPr>
+              <w:t>比較項目</w:t>
+            </w:r>
+          </w:p>
+        </w:tc>
+        <w:tc>
+          <w:tcPr>
+            <w:tcW w:type="dxa" w:w="6463"/>
+            <w:vAlign w:val="center"/>
+            <w:tcMar>
+              <w:top w:w="80" w:type="dxa"/>
+              <w:left w:w="80" w:type="dxa"/>
+              <w:bottom w:w="80" w:type="dxa"/>
+              <w:right w:w="80" w:type="dxa"/>
+            </w:tcMar>
+            <w:shd w:fill="E8EFF6"/>
+          </w:tcPr>
+          <w:p>
+            <w:pPr>
+              <w:spacing w:after="40" w:before="40" w:line="276" w:lineRule="auto"/>
+            </w:pPr>
+            <w:r>
+              <w:rPr>
+                <w:b/>
+                <w:sz w:val="20"/>
+              </w:rPr>
+              <w:t>読み方</w:t>
+            </w:r>
+          </w:p>
+        </w:tc>
+      </w:tr>
+      <w:tr>
+        <w:trPr>
+          <w:cantSplit/>
+        </w:trPr>
+        <w:tc>
+          <w:tcPr>
+            <w:tcW w:type="dxa" w:w="2948"/>
+            <w:vAlign w:val="center"/>
+            <w:tcMar>
+              <w:top w:w="80" w:type="dxa"/>
+              <w:left w:w="80" w:type="dxa"/>
+              <w:bottom w:w="80" w:type="dxa"/>
+              <w:right w:w="80" w:type="dxa"/>
+            </w:tcMar>
+          </w:tcPr>
+          <w:p>
+            <w:pPr>
+              <w:spacing w:after="40" w:before="40" w:line="276" w:lineRule="auto"/>
+            </w:pPr>
+            <w:r>
+              <w:rPr>
+                <w:sz w:val="20"/>
+              </w:rPr>
+              <w:t>PDF全体</w:t>
+            </w:r>
+          </w:p>
+        </w:tc>
+        <w:tc>
+          <w:tcPr>
+            <w:tcW w:type="dxa" w:w="6463"/>
+            <w:vAlign w:val="center"/>
+            <w:tcMar>
+              <w:top w:w="80" w:type="dxa"/>
+              <w:left w:w="80" w:type="dxa"/>
+              <w:bottom w:w="80" w:type="dxa"/>
+              <w:right w:w="80" w:type="dxa"/>
+            </w:tcMar>
+          </w:tcPr>
+          <w:p>
+            <w:pPr>
+              <w:spacing w:after="40" w:before="40" w:line="276" w:lineRule="auto"/>
+            </w:pPr>
+            <w:r>
+              <w:rPr>
+                <w:sz w:val="20"/>
+              </w:rPr>
+              <w:t>PDF本体・レイヤーなし・全レイヤーを集約した一致状況</w:t>
             </w:r>
           </w:p>
         </w:tc>
@@ -1031,7 +736,7 @@
               <w:rPr>
                 <w:sz w:val="20"/>
               </w:rPr>
-              <w:t>ページ数、用紙領域、回転などのページ・文書の構造です。本文の文字すべてを意味しません</w:t>
+              <w:t>ページ数・用紙領域・回転・対応文書属性など</w:t>
             </w:r>
           </w:p>
         </w:tc>
@@ -1082,7 +787,7 @@
               <w:rPr>
                 <w:sz w:val="20"/>
               </w:rPr>
-              <w:t>レイヤーに所属しない本文や注釈です。DEMOスタンプ・URIリンクも含みます</w:t>
+              <w:t>どのレイヤーにも属さない本文描画・注釈など</w:t>
             </w:r>
           </w:p>
         </w:tc>
@@ -1110,7 +815,7 @@
               <w:rPr>
                 <w:sz w:val="20"/>
               </w:rPr>
-              <w:t>レイヤー: 名前</w:t>
+              <w:t>各レイヤー名</w:t>
             </w:r>
           </w:p>
         </w:tc>
@@ -1133,202 +838,7 @@
               <w:rPr>
                 <w:sz w:val="20"/>
               </w:rPr>
-              <w:t>その名前のレイヤーに所属する本文・注釈と関連設定です</w:t>
-            </w:r>
-          </w:p>
-        </w:tc>
-      </w:tr>
-    </w:tbl>
-    <w:p>
-      <w:pPr>
-        <w:spacing w:after="40"/>
-      </w:pPr>
-    </w:p>
-    <w:p>
-      <w:r>
-        <w:t>特定グループの不一致は、そのPDFのすべてのレイヤーが不一致という意味ではありません。画面の「比較完了」は処理が終わった意味であり、全グループ一致という意味ではありません。PDF全体の総合判定は表示しません。</w:t>
-      </w:r>
-    </w:p>
-    <w:p>
-      <w:pPr>
-        <w:keepNext/>
-        <w:keepLines/>
-        <w:jc w:val="center"/>
-      </w:pPr>
-      <w:r>
-        <w:drawing>
-          <wp:inline xmlns:a="http://schemas.openxmlformats.org/drawingml/2006/main" xmlns:pic="http://schemas.openxmlformats.org/drawingml/2006/picture">
-            <wp:extent cx="5510000" cy="3960000"/>
-            <wp:docPr id="3" name="Picture 3" descr="比較完了後のグループ別結果一覧"/>
-            <wp:cNvGraphicFramePr>
-              <a:graphicFrameLocks noChangeAspect="1"/>
-            </wp:cNvGraphicFramePr>
-            <a:graphic>
-              <a:graphicData uri="http://schemas.openxmlformats.org/drawingml/2006/picture">
-                <pic:pic>
-                  <pic:nvPicPr>
-                    <pic:cNvPr id="0" name="comparison-results.png"/>
-                    <pic:cNvPicPr/>
-                  </pic:nvPicPr>
-                  <pic:blipFill>
-                    <a:blip r:embed="rId14"/>
-                    <a:stretch>
-                      <a:fillRect/>
-                    </a:stretch>
-                  </pic:blipFill>
-                  <pic:spPr>
-                    <a:xfrm>
-                      <a:off x="0" y="0"/>
-                      <a:ext cx="5510000" cy="3960000"/>
-                    </a:xfrm>
-                    <a:prstGeom prst="rect"/>
-                  </pic:spPr>
-                </pic:pic>
-              </a:graphicData>
-            </a:graphic>
-          </wp:inline>
-        </w:drawing>
-      </w:r>
-    </w:p>
-    <w:p>
-      <w:pPr>
-        <w:pStyle w:val="Caption"/>
-        <w:keepLines/>
-      </w:pPr>
-      <w:r>
-        <w:t>図3 比較結果の一覧：基準と各比較対象について、PDF本体・レイヤーなし・各レイヤーの計8行が表示された例です。右上の「結果を保存」も使用できます。</w:t>
-      </w:r>
-    </w:p>
-    <w:p>
-      <w:pPr>
-        <w:keepNext/>
-        <w:keepLines/>
-        <w:jc w:val="center"/>
-      </w:pPr>
-      <w:r>
-        <w:drawing>
-          <wp:inline xmlns:a="http://schemas.openxmlformats.org/drawingml/2006/main" xmlns:pic="http://schemas.openxmlformats.org/drawingml/2006/picture">
-            <wp:extent cx="5220000" cy="1592051"/>
-            <wp:docPr id="4" name="Picture 4" descr="対象と判定の列の部分拡大"/>
-            <wp:cNvGraphicFramePr>
-              <a:graphicFrameLocks noChangeAspect="1"/>
-            </wp:cNvGraphicFramePr>
-            <a:graphic>
-              <a:graphicData uri="http://schemas.openxmlformats.org/drawingml/2006/picture">
-                <pic:pic>
-                  <pic:nvPicPr>
-                    <pic:cNvPr id="0" name="comparison-results-zoom.png"/>
-                    <pic:cNvPicPr/>
-                  </pic:nvPicPr>
-                  <pic:blipFill>
-                    <a:blip r:embed="rId15"/>
-                    <a:stretch>
-                      <a:fillRect/>
-                    </a:stretch>
-                  </pic:blipFill>
-                  <pic:spPr>
-                    <a:xfrm>
-                      <a:off x="0" y="0"/>
-                      <a:ext cx="5220000" cy="1592051"/>
-                    </a:xfrm>
-                    <a:prstGeom prst="rect"/>
-                  </pic:spPr>
-                </pic:pic>
-              </a:graphicData>
-            </a:graphic>
-          </wp:inline>
-        </w:drawing>
-      </w:r>
-    </w:p>
-    <w:p>
-      <w:pPr>
-        <w:pStyle w:val="Caption"/>
-        <w:keepLines/>
-      </w:pPr>
-      <w:r>
-        <w:t>図4 対象と判定の部分拡大：checked-a.pdfの担当者レイヤーは不一致、checked-b.pdfの担当者レイヤーは一致（フォントのみ変更）です。他グループは一致しています。</w:t>
-      </w:r>
-    </w:p>
-    <w:p>
-      <w:bookmarkStart w:id="7" w:name="manual_ch_7"/>
-      <w:pPr>
-        <w:pStyle w:val="Heading1"/>
-      </w:pPr>
-      <w:r>
-        <w:t>7. 6種類の判定</w:t>
-      </w:r>
-      <w:bookmarkEnd w:id="7"/>
-    </w:p>
-    <w:tbl>
-      <w:tblPr>
-        <w:tblW w:type="auto" w:w="0"/>
-        <w:tblLayout w:type="fixed"/>
-        <w:tblLook w:firstColumn="1" w:firstRow="1" w:lastColumn="0" w:lastRow="0" w:noHBand="0" w:noVBand="1" w:val="04A0"/>
-        <w:tblBorders>
-          <w:top w:val="single" w:sz="4" w:color="D9D9D9"/>
-          <w:left w:val="single" w:sz="4" w:color="D9D9D9"/>
-          <w:bottom w:val="single" w:sz="4" w:color="D9D9D9"/>
-          <w:right w:val="single" w:sz="4" w:color="D9D9D9"/>
-          <w:insideH w:val="single" w:sz="4" w:color="D9D9D9"/>
-          <w:insideV w:val="single" w:sz="4" w:color="D9D9D9"/>
-        </w:tblBorders>
-      </w:tblPr>
-      <w:tblGrid>
-        <w:gridCol w:w="2948"/>
-        <w:gridCol w:w="6463"/>
-      </w:tblGrid>
-      <w:tr>
-        <w:trPr>
-          <w:cantSplit/>
-          <w:tblHeader/>
-        </w:trPr>
-        <w:tc>
-          <w:tcPr>
-            <w:tcW w:type="dxa" w:w="2948"/>
-            <w:vAlign w:val="center"/>
-            <w:tcMar>
-              <w:top w:w="80" w:type="dxa"/>
-              <w:left w:w="80" w:type="dxa"/>
-              <w:bottom w:w="80" w:type="dxa"/>
-              <w:right w:w="80" w:type="dxa"/>
-            </w:tcMar>
-            <w:shd w:fill="E8EFF6"/>
-          </w:tcPr>
-          <w:p>
-            <w:pPr>
-              <w:spacing w:after="40" w:before="40" w:line="276" w:lineRule="auto"/>
-            </w:pPr>
-            <w:r>
-              <w:rPr>
-                <w:b/>
-                <w:sz w:val="20"/>
-              </w:rPr>
-              <w:t>判定</w:t>
-            </w:r>
-          </w:p>
-        </w:tc>
-        <w:tc>
-          <w:tcPr>
-            <w:tcW w:type="dxa" w:w="6463"/>
-            <w:vAlign w:val="center"/>
-            <w:tcMar>
-              <w:top w:w="80" w:type="dxa"/>
-              <w:left w:w="80" w:type="dxa"/>
-              <w:bottom w:w="80" w:type="dxa"/>
-              <w:right w:w="80" w:type="dxa"/>
-            </w:tcMar>
-            <w:shd w:fill="E8EFF6"/>
-          </w:tcPr>
-          <w:p>
-            <w:pPr>
-              <w:spacing w:after="40" w:before="40" w:line="276" w:lineRule="auto"/>
-            </w:pPr>
-            <w:r>
-              <w:rPr>
-                <w:b/>
-                <w:sz w:val="20"/>
-              </w:rPr>
-              <w:t>読み方・対応</w:t>
+              <w:t>同一名のレイヤー内容と関連設定の比較</w:t>
             </w:r>
           </w:p>
         </w:tc>
@@ -1356,7 +866,7 @@
               <w:rPr>
                 <w:sz w:val="20"/>
               </w:rPr>
-              <w:t>一致</w:t>
+              <w:t>業務判定</w:t>
             </w:r>
           </w:p>
         </w:tc>
@@ -1379,7 +889,7 @@
               <w:rPr>
                 <w:sz w:val="20"/>
               </w:rPr>
-              <w:t>対応範囲内の構造比較で内容が同じです。見た目や記載内容の正しさの保証ではありません</w:t>
+              <w:t>工程ごとの一致必須項目から判定した結果</w:t>
             </w:r>
           </w:p>
         </w:tc>
@@ -1407,7 +917,7 @@
               <w:rPr>
                 <w:sz w:val="20"/>
               </w:rPr>
-              <w:t>一致（フォントのみ変更）</w:t>
+              <w:t>基準PDF外</w:t>
             </w:r>
           </w:p>
         </w:tc>
@@ -1430,211 +940,7 @@
               <w:rPr>
                 <w:sz w:val="20"/>
               </w:rPr>
-              <w:t>文字と明示した配置等は同じと確認できましたが、フォントに差があります。詳細と実際の表示を確認してください</w:t>
-            </w:r>
-          </w:p>
-        </w:tc>
-      </w:tr>
-      <w:tr>
-        <w:trPr>
-          <w:cantSplit/>
-        </w:trPr>
-        <w:tc>
-          <w:tcPr>
-            <w:tcW w:type="dxa" w:w="2948"/>
-            <w:vAlign w:val="center"/>
-            <w:tcMar>
-              <w:top w:w="80" w:type="dxa"/>
-              <w:left w:w="80" w:type="dxa"/>
-              <w:bottom w:w="80" w:type="dxa"/>
-              <w:right w:w="80" w:type="dxa"/>
-            </w:tcMar>
-          </w:tcPr>
-          <w:p>
-            <w:pPr>
-              <w:spacing w:after="40" w:before="40" w:line="276" w:lineRule="auto"/>
-            </w:pPr>
-            <w:r>
-              <w:rPr>
-                <w:sz w:val="20"/>
-              </w:rPr>
-              <w:t>不一致</w:t>
-            </w:r>
-          </w:p>
-        </w:tc>
-        <w:tc>
-          <w:tcPr>
-            <w:tcW w:type="dxa" w:w="6463"/>
-            <w:vAlign w:val="center"/>
-            <w:tcMar>
-              <w:top w:w="80" w:type="dxa"/>
-              <w:left w:w="80" w:type="dxa"/>
-              <w:bottom w:w="80" w:type="dxa"/>
-              <w:right w:w="80" w:type="dxa"/>
-            </w:tcMar>
-          </w:tcPr>
-          <w:p>
-            <w:pPr>
-              <w:spacing w:after="40" w:before="40" w:line="276" w:lineRule="auto"/>
-            </w:pPr>
-            <w:r>
-              <w:rPr>
-                <w:sz w:val="20"/>
-              </w:rPr>
-              <w:t>比較できた内容・構造に差があります。詳細の差とPDFを照合してください</w:t>
-            </w:r>
-          </w:p>
-        </w:tc>
-      </w:tr>
-      <w:tr>
-        <w:trPr>
-          <w:cantSplit/>
-        </w:trPr>
-        <w:tc>
-          <w:tcPr>
-            <w:tcW w:type="dxa" w:w="2948"/>
-            <w:vAlign w:val="center"/>
-            <w:tcMar>
-              <w:top w:w="80" w:type="dxa"/>
-              <w:left w:w="80" w:type="dxa"/>
-              <w:bottom w:w="80" w:type="dxa"/>
-              <w:right w:w="80" w:type="dxa"/>
-            </w:tcMar>
-          </w:tcPr>
-          <w:p>
-            <w:pPr>
-              <w:spacing w:after="40" w:before="40" w:line="276" w:lineRule="auto"/>
-            </w:pPr>
-            <w:r>
-              <w:rPr>
-                <w:sz w:val="20"/>
-              </w:rPr>
-              <w:t>新規追加</w:t>
-            </w:r>
-          </w:p>
-        </w:tc>
-        <w:tc>
-          <w:tcPr>
-            <w:tcW w:type="dxa" w:w="6463"/>
-            <w:vAlign w:val="center"/>
-            <w:tcMar>
-              <w:top w:w="80" w:type="dxa"/>
-              <w:left w:w="80" w:type="dxa"/>
-              <w:bottom w:w="80" w:type="dxa"/>
-              <w:right w:w="80" w:type="dxa"/>
-            </w:tcMar>
-          </w:tcPr>
-          <w:p>
-            <w:pPr>
-              <w:spacing w:after="40" w:before="40" w:line="276" w:lineRule="auto"/>
-            </w:pPr>
-            <w:r>
-              <w:rPr>
-                <w:sz w:val="20"/>
-              </w:rPr>
-              <w:t>基準にない名前のレイヤーが比較対象にあります</w:t>
-            </w:r>
-          </w:p>
-        </w:tc>
-      </w:tr>
-      <w:tr>
-        <w:trPr>
-          <w:cantSplit/>
-        </w:trPr>
-        <w:tc>
-          <w:tcPr>
-            <w:tcW w:type="dxa" w:w="2948"/>
-            <w:vAlign w:val="center"/>
-            <w:tcMar>
-              <w:top w:w="80" w:type="dxa"/>
-              <w:left w:w="80" w:type="dxa"/>
-              <w:bottom w:w="80" w:type="dxa"/>
-              <w:right w:w="80" w:type="dxa"/>
-            </w:tcMar>
-          </w:tcPr>
-          <w:p>
-            <w:pPr>
-              <w:spacing w:after="40" w:before="40" w:line="276" w:lineRule="auto"/>
-            </w:pPr>
-            <w:r>
-              <w:rPr>
-                <w:sz w:val="20"/>
-              </w:rPr>
-              <w:t>削除</w:t>
-            </w:r>
-          </w:p>
-        </w:tc>
-        <w:tc>
-          <w:tcPr>
-            <w:tcW w:type="dxa" w:w="6463"/>
-            <w:vAlign w:val="center"/>
-            <w:tcMar>
-              <w:top w:w="80" w:type="dxa"/>
-              <w:left w:w="80" w:type="dxa"/>
-              <w:bottom w:w="80" w:type="dxa"/>
-              <w:right w:w="80" w:type="dxa"/>
-            </w:tcMar>
-          </w:tcPr>
-          <w:p>
-            <w:pPr>
-              <w:spacing w:after="40" w:before="40" w:line="276" w:lineRule="auto"/>
-            </w:pPr>
-            <w:r>
-              <w:rPr>
-                <w:sz w:val="20"/>
-              </w:rPr>
-              <w:t>基準にある名前のレイヤーが比較対象にありません</w:t>
-            </w:r>
-          </w:p>
-        </w:tc>
-      </w:tr>
-      <w:tr>
-        <w:trPr>
-          <w:cantSplit/>
-        </w:trPr>
-        <w:tc>
-          <w:tcPr>
-            <w:tcW w:type="dxa" w:w="2948"/>
-            <w:vAlign w:val="center"/>
-            <w:tcMar>
-              <w:top w:w="80" w:type="dxa"/>
-              <w:left w:w="80" w:type="dxa"/>
-              <w:bottom w:w="80" w:type="dxa"/>
-              <w:right w:w="80" w:type="dxa"/>
-            </w:tcMar>
-          </w:tcPr>
-          <w:p>
-            <w:pPr>
-              <w:spacing w:after="40" w:before="40" w:line="276" w:lineRule="auto"/>
-            </w:pPr>
-            <w:r>
-              <w:rPr>
-                <w:sz w:val="20"/>
-              </w:rPr>
-              <w:t>検証不能</w:t>
-            </w:r>
-          </w:p>
-        </w:tc>
-        <w:tc>
-          <w:tcPr>
-            <w:tcW w:type="dxa" w:w="6463"/>
-            <w:vAlign w:val="center"/>
-            <w:tcMar>
-              <w:top w:w="80" w:type="dxa"/>
-              <w:left w:w="80" w:type="dxa"/>
-              <w:bottom w:w="80" w:type="dxa"/>
-              <w:right w:w="80" w:type="dxa"/>
-            </w:tcMar>
-          </w:tcPr>
-          <w:p>
-            <w:pPr>
-              <w:spacing w:after="40" w:before="40" w:line="276" w:lineRule="auto"/>
-            </w:pPr>
-            <w:r>
-              <w:rPr>
-                <w:sz w:val="20"/>
-              </w:rPr>
-              <w:t>未対応構造、破損、暗号化、所属不明等で安全に確認できません。理由を読み、対象を目視確認してください</w:t>
+              <w:t>入力のいずれかにあり、基準PDFにない追加レイヤー</w:t>
             </w:r>
           </w:p>
         </w:tc>
@@ -1647,176 +953,23 @@
     </w:p>
     <w:p>
       <w:r>
-        <w:t>レイヤーの名前変更は、旧名の削除と新名の追加になります。注釈1個の追加・削除は、レイヤーの新規追加・削除ではなく、その注釈が属するグループの不一致になります。</w:t>
-      </w:r>
-    </w:p>
-    <w:p>
-      <w:pPr>
-        <w:pStyle w:val="Heading2"/>
-      </w:pPr>
-      <w:r>
-        <w:t>フォントのみ変更について</w:t>
+        <w:t>内容の判定は一致・不一致・検証不能です。レイヤーの追加・削除やフォントのみの変更も、不一致として理由を表示します。PDF全体は不一致を優先し、不一致がなく検証不能を含めば検証不能、すべて一致なら一致となります。</w:t>
       </w:r>
     </w:p>
     <w:p>
       <w:r>
-        <w:t>フォント名、埋め込みデータ、文字マッピング等が変わった場合でも、文字と非フォント属性が安全に一致すると確認できる場合だけ専用判定を表示します。字形・字幅・画素単位の位置や読みやすさの一致を保証するものではありません。表示されるフォント名はPDF内の記録名等です。</w:t>
+        <w:t>「全組合せの結果」タブには、前工程同士を含むすべての組のPDF全体・業務判定を表示します。各タブの結果行を選ぶと、差異や検証不能の理由、注釈の作成者記録を詳細欄で確認できます。</w:t>
       </w:r>
     </w:p>
     <w:p>
-      <w:r>
-        <w:t>フォントを変える編集操作で文字位置や大きさも変われば不一致になることがあります。逆に、文字内容を安全に復元できない場合は検証不能になります。表示が似ているという理由で判定を一致へ置き換えないでください。</w:t>
-      </w:r>
-    </w:p>
-    <w:p>
-      <w:pPr>
-        <w:pStyle w:val="Heading2"/>
-      </w:pPr>
-      <w:r>
-        <w:t>検証不能について</w:t>
-      </w:r>
-    </w:p>
-    <w:p>
-      <w:r>
-        <w:t>比較は失敗した範囲を一致として扱いません。元PDFが壊れている場合だけでなく、本ツールが対応しない構造でも検証不能になります。詳細に表示されるファイル・ページ・理由を確認し、必要な範囲をPDF表示ソフトで確認してください。保管している元PDFを、このツールの都合だけで上書きする必要はありません。</w:t>
-      </w:r>
-    </w:p>
-    <w:p>
-      <w:r>
-        <w:t>同じPDF同士であっても検証不能になることがあります。パスワードなしで開ける暗号化PDFも対象外です。対応範囲は</w:t>
-      </w:r>
-      <w:hyperlink r:id="rId16">
-        <w:r>
-          <w:rPr>
-            <w:color w:val="1F4E79"/>
-            <w:u w:val="single"/>
-          </w:rPr>
-          <w:t>対応構造一覧</w:t>
-        </w:r>
-      </w:hyperlink>
-      <w:r>
-        <w:t>を参照してください。</w:t>
-      </w:r>
-    </w:p>
-    <w:p>
-      <w:bookmarkStart w:id="8" w:name="manual_ch_8"/>
+      <w:bookmarkStart w:id="5" w:name="manual_ch_5"/>
       <w:pPr>
         <w:pStyle w:val="Heading1"/>
       </w:pPr>
       <w:r>
-        <w:t>8. 注釈の作成者名と件数</w:t>
+        <w:t>5 業務判定を読む</w:t>
       </w:r>
-      <w:bookmarkEnd w:id="8"/>
-    </w:p>
-    <w:p>
-      <w:r>
-        <w:t>レイヤーなし・各レイヤーの行を選ぶと、「注釈の作成者名（PDF記録値）」として基準PDFと比較対象PDFの一覧を表示します。PDF本体にはこの集計はありません。</w:t>
-      </w:r>
-    </w:p>
-    <w:p>
-      <w:r>
-        <w:t>一覧と詳細欄の境界を上下にドラッグすると、詳細を表示する範囲を広げられます。必要に応じて詳細欄をスクロールしてください。</w:t>
-      </w:r>
-    </w:p>
-    <w:p>
-      <w:pPr>
-        <w:keepNext/>
-        <w:keepLines/>
-        <w:jc w:val="center"/>
-      </w:pPr>
-      <w:r>
-        <w:drawing>
-          <wp:inline xmlns:a="http://schemas.openxmlformats.org/drawingml/2006/main" xmlns:pic="http://schemas.openxmlformats.org/drawingml/2006/picture">
-            <wp:extent cx="5976000" cy="1334148"/>
-            <wp:docPr id="5" name="Picture 5" descr="選択したフォント変更結果の詳細欄"/>
-            <wp:cNvGraphicFramePr>
-              <a:graphicFrameLocks noChangeAspect="1"/>
-            </wp:cNvGraphicFramePr>
-            <a:graphic>
-              <a:graphicData uri="http://schemas.openxmlformats.org/drawingml/2006/picture">
-                <pic:pic>
-                  <pic:nvPicPr>
-                    <pic:cNvPr id="0" name="result-details.png"/>
-                    <pic:cNvPicPr/>
-                  </pic:nvPicPr>
-                  <pic:blipFill>
-                    <a:blip r:embed="rId17"/>
-                    <a:stretch>
-                      <a:fillRect/>
-                    </a:stretch>
-                  </pic:blipFill>
-                  <pic:spPr>
-                    <a:xfrm>
-                      <a:off x="0" y="0"/>
-                      <a:ext cx="5976000" cy="1334148"/>
-                    </a:xfrm>
-                    <a:prstGeom prst="rect"/>
-                  </pic:spPr>
-                </pic:pic>
-              </a:graphicData>
-            </a:graphic>
-          </wp:inline>
-        </w:drawing>
-      </w:r>
-    </w:p>
-    <w:p>
-      <w:pPr>
-        <w:pStyle w:val="Caption"/>
-        <w:keepLines/>
-      </w:pPr>
-      <w:r>
-        <w:t>図5 選択行の詳細：担当者レイヤーの内容判定、HelveticaからCourierへのフォント変更、双方の作成者情報を表示した例です。</w:t>
-      </w:r>
-    </w:p>
-    <w:p>
-      <w:pPr>
-        <w:keepNext/>
-        <w:keepLines/>
-        <w:jc w:val="center"/>
-      </w:pPr>
-      <w:r>
-        <w:drawing>
-          <wp:inline xmlns:a="http://schemas.openxmlformats.org/drawingml/2006/main" xmlns:pic="http://schemas.openxmlformats.org/drawingml/2006/picture">
-            <wp:extent cx="5220000" cy="934207"/>
-            <wp:docPr id="6" name="Picture 6" descr="作成者名と件数の部分拡大"/>
-            <wp:cNvGraphicFramePr>
-              <a:graphicFrameLocks noChangeAspect="1"/>
-            </wp:cNvGraphicFramePr>
-            <a:graphic>
-              <a:graphicData uri="http://schemas.openxmlformats.org/drawingml/2006/picture">
-                <pic:pic>
-                  <pic:nvPicPr>
-                    <pic:cNvPr id="0" name="author-details.png"/>
-                    <pic:cNvPicPr/>
-                  </pic:nvPicPr>
-                  <pic:blipFill>
-                    <a:blip r:embed="rId18"/>
-                    <a:stretch>
-                      <a:fillRect/>
-                    </a:stretch>
-                  </pic:blipFill>
-                  <pic:spPr>
-                    <a:xfrm>
-                      <a:off x="0" y="0"/>
-                      <a:ext cx="5220000" cy="934207"/>
-                    </a:xfrm>
-                    <a:prstGeom prst="rect"/>
-                  </pic:spPr>
-                </pic:pic>
-              </a:graphicData>
-            </a:graphic>
-          </wp:inline>
-        </w:drawing>
-      </w:r>
-    </w:p>
-    <w:p>
-      <w:pPr>
-        <w:pStyle w:val="Caption"/>
-        <w:keepLines/>
-      </w:pPr>
-      <w:r>
-        <w:t>図6 作成者情報の部分拡大：基準のuserAが1件、比較対象のuserBが1件で、構成に変更があります。内容判定は図5の一致（フォントのみ変更）のままです。</w:t>
-      </w:r>
+      <w:bookmarkEnd w:id="5"/>
     </w:p>
     <w:tbl>
       <w:tblPr>
@@ -1833,8 +986,9 @@
         </w:tblBorders>
       </w:tblPr>
       <w:tblGrid>
-        <w:gridCol w:w="2948"/>
-        <w:gridCol w:w="6463"/>
+        <w:gridCol w:w="3137"/>
+        <w:gridCol w:w="3137"/>
+        <w:gridCol w:w="3137"/>
       </w:tblGrid>
       <w:tr>
         <w:trPr>
@@ -1843,7 +997,7 @@
         </w:trPr>
         <w:tc>
           <w:tcPr>
-            <w:tcW w:type="dxa" w:w="2948"/>
+            <w:tcW w:type="dxa" w:w="3137"/>
             <w:vAlign w:val="center"/>
             <w:tcMar>
               <w:top w:w="80" w:type="dxa"/>
@@ -1862,13 +1016,13 @@
                 <w:b/>
                 <w:sz w:val="20"/>
               </w:rPr>
-              <w:t>表示</w:t>
+              <w:t>比較する工程</w:t>
             </w:r>
           </w:p>
         </w:tc>
         <w:tc>
           <w:tcPr>
-            <w:tcW w:type="dxa" w:w="6463"/>
+            <w:tcW w:type="dxa" w:w="3137"/>
             <w:vAlign w:val="center"/>
             <w:tcMar>
               <w:top w:w="80" w:type="dxa"/>
@@ -1887,7 +1041,32 @@
                 <w:b/>
                 <w:sz w:val="20"/>
               </w:rPr>
-              <w:t>意味</w:t>
+              <w:t>一致必須の業務レイヤー</w:t>
+            </w:r>
+          </w:p>
+        </w:tc>
+        <w:tc>
+          <w:tcPr>
+            <w:tcW w:type="dxa" w:w="3137"/>
+            <w:vAlign w:val="center"/>
+            <w:tcMar>
+              <w:top w:w="80" w:type="dxa"/>
+              <w:left w:w="80" w:type="dxa"/>
+              <w:bottom w:w="80" w:type="dxa"/>
+              <w:right w:w="80" w:type="dxa"/>
+            </w:tcMar>
+            <w:shd w:fill="E8EFF6"/>
+          </w:tcPr>
+          <w:p>
+            <w:pPr>
+              <w:spacing w:after="40" w:before="40" w:line="276" w:lineRule="auto"/>
+            </w:pPr>
+            <w:r>
+              <w:rPr>
+                <w:b/>
+                <w:sz w:val="20"/>
+              </w:rPr>
+              <w:t>差異を許容する業務レイヤー</w:t>
             </w:r>
           </w:p>
         </w:tc>
@@ -1898,7 +1077,7 @@
         </w:trPr>
         <w:tc>
           <w:tcPr>
-            <w:tcW w:type="dxa" w:w="2948"/>
+            <w:tcW w:type="dxa" w:w="3137"/>
             <w:vAlign w:val="center"/>
             <w:tcMar>
               <w:top w:w="80" w:type="dxa"/>
@@ -1915,13 +1094,13 @@
               <w:rPr>
                 <w:sz w:val="20"/>
               </w:rPr>
-              <w:t>名前と件数</w:t>
+              <w:t>承認と審査</w:t>
             </w:r>
           </w:p>
         </w:tc>
         <w:tc>
           <w:tcPr>
-            <w:tcW w:type="dxa" w:w="6463"/>
+            <w:tcW w:type="dxa" w:w="3137"/>
             <w:vAlign w:val="center"/>
             <w:tcMar>
               <w:top w:w="80" w:type="dxa"/>
@@ -1938,18 +1117,13 @@
               <w:rPr>
                 <w:sz w:val="20"/>
               </w:rPr>
-              <w:t>PDFに記録された名前ごとの注釈数です。同じ名前は集計します</w:t>
+              <w:t>担当・確認・審査</w:t>
             </w:r>
           </w:p>
         </w:tc>
-      </w:tr>
-      <w:tr>
-        <w:trPr>
-          <w:cantSplit/>
-        </w:trPr>
         <w:tc>
           <w:tcPr>
-            <w:tcW w:type="dxa" w:w="2948"/>
+            <w:tcW w:type="dxa" w:w="3137"/>
             <w:vAlign w:val="center"/>
             <w:tcMar>
               <w:top w:w="80" w:type="dxa"/>
@@ -1966,13 +1140,18 @@
               <w:rPr>
                 <w:sz w:val="20"/>
               </w:rPr>
-              <w:t>作成者名未設定</w:t>
+              <w:t>承認</w:t>
             </w:r>
           </w:p>
         </w:tc>
+      </w:tr>
+      <w:tr>
+        <w:trPr>
+          <w:cantSplit/>
+        </w:trPr>
         <w:tc>
           <w:tcPr>
-            <w:tcW w:type="dxa" w:w="6463"/>
+            <w:tcW w:type="dxa" w:w="3137"/>
             <w:vAlign w:val="center"/>
             <w:tcMar>
               <w:top w:w="80" w:type="dxa"/>
@@ -1989,18 +1168,13 @@
               <w:rPr>
                 <w:sz w:val="20"/>
               </w:rPr>
-              <w:t>記録がない、または空文字の注釈です</w:t>
+              <w:t>承認と確認</w:t>
             </w:r>
           </w:p>
         </w:tc>
-      </w:tr>
-      <w:tr>
-        <w:trPr>
-          <w:cantSplit/>
-        </w:trPr>
         <w:tc>
           <w:tcPr>
-            <w:tcW w:type="dxa" w:w="2948"/>
+            <w:tcW w:type="dxa" w:w="3137"/>
             <w:vAlign w:val="center"/>
             <w:tcMar>
               <w:top w:w="80" w:type="dxa"/>
@@ -2017,13 +1191,13 @@
               <w:rPr>
                 <w:sz w:val="20"/>
               </w:rPr>
-              <w:t>注釈なし</w:t>
+              <w:t>担当・確認</w:t>
             </w:r>
           </w:p>
         </w:tc>
         <w:tc>
           <w:tcPr>
-            <w:tcW w:type="dxa" w:w="6463"/>
+            <w:tcW w:type="dxa" w:w="3137"/>
             <w:vAlign w:val="center"/>
             <w:tcMar>
               <w:top w:w="80" w:type="dxa"/>
@@ -2040,7 +1214,7 @@
               <w:rPr>
                 <w:sz w:val="20"/>
               </w:rPr>
-              <w:t>集計が完了し、そのグループに注釈がありません</w:t>
+              <w:t>審査・承認</w:t>
             </w:r>
           </w:p>
         </w:tc>
@@ -2051,7 +1225,7 @@
         </w:trPr>
         <w:tc>
           <w:tcPr>
-            <w:tcW w:type="dxa" w:w="2948"/>
+            <w:tcW w:type="dxa" w:w="3137"/>
             <w:vAlign w:val="center"/>
             <w:tcMar>
               <w:top w:w="80" w:type="dxa"/>
@@ -2068,13 +1242,13 @@
               <w:rPr>
                 <w:sz w:val="20"/>
               </w:rPr>
-              <w:t>このPDFに該当グループなし</w:t>
+              <w:t>承認と担当</w:t>
             </w:r>
           </w:p>
         </w:tc>
         <w:tc>
           <w:tcPr>
-            <w:tcW w:type="dxa" w:w="6463"/>
+            <w:tcW w:type="dxa" w:w="3137"/>
             <w:vAlign w:val="center"/>
             <w:tcMar>
               <w:top w:w="80" w:type="dxa"/>
@@ -2091,18 +1265,13 @@
               <w:rPr>
                 <w:sz w:val="20"/>
               </w:rPr>
-              <w:t>追加・削除等で、そのPDFにレイヤーがありません</w:t>
+              <w:t>担当</w:t>
             </w:r>
           </w:p>
         </w:tc>
-      </w:tr>
-      <w:tr>
-        <w:trPr>
-          <w:cantSplit/>
-        </w:trPr>
         <w:tc>
           <w:tcPr>
-            <w:tcW w:type="dxa" w:w="2948"/>
+            <w:tcW w:type="dxa" w:w="3137"/>
             <w:vAlign w:val="center"/>
             <w:tcMar>
               <w:top w:w="80" w:type="dxa"/>
@@ -2119,13 +1288,18 @@
               <w:rPr>
                 <w:sz w:val="20"/>
               </w:rPr>
-              <w:t>集計未完了／作成者名取得不能</w:t>
+              <w:t>確認・審査・承認</w:t>
             </w:r>
           </w:p>
         </w:tc>
+      </w:tr>
+      <w:tr>
+        <w:trPr>
+          <w:cantSplit/>
+        </w:trPr>
         <w:tc>
           <w:tcPr>
-            <w:tcW w:type="dxa" w:w="6463"/>
+            <w:tcW w:type="dxa" w:w="3137"/>
             <w:vAlign w:val="center"/>
             <w:tcMar>
               <w:top w:w="80" w:type="dxa"/>
@@ -2142,18 +1316,13 @@
               <w:rPr>
                 <w:sz w:val="20"/>
               </w:rPr>
-              <w:t>取得できた範囲だけを表示しています。完全な一覧ではありません</w:t>
+              <w:t>審査と確認</w:t>
             </w:r>
           </w:p>
         </w:tc>
-      </w:tr>
-      <w:tr>
-        <w:trPr>
-          <w:cantSplit/>
-        </w:trPr>
         <w:tc>
           <w:tcPr>
-            <w:tcW w:type="dxa" w:w="2948"/>
+            <w:tcW w:type="dxa" w:w="3137"/>
             <w:vAlign w:val="center"/>
             <w:tcMar>
               <w:top w:w="80" w:type="dxa"/>
@@ -2170,13 +1339,13 @@
               <w:rPr>
                 <w:sz w:val="20"/>
               </w:rPr>
-              <w:t>構成に変更があります／ありません</w:t>
+              <w:t>担当・確認</w:t>
             </w:r>
           </w:p>
         </w:tc>
         <w:tc>
           <w:tcPr>
-            <w:tcW w:type="dxa" w:w="6463"/>
+            <w:tcW w:type="dxa" w:w="3137"/>
             <w:vAlign w:val="center"/>
             <w:tcMar>
               <w:top w:w="80" w:type="dxa"/>
@@ -2193,7 +1362,7 @@
               <w:rPr>
                 <w:sz w:val="20"/>
               </w:rPr>
-              <w:t>双方の完全な集計で、名前別件数と未設定件数を比較した結果です</w:t>
+              <w:t>審査・承認</w:t>
             </w:r>
           </w:p>
         </w:tc>
@@ -2204,7 +1373,7 @@
         </w:trPr>
         <w:tc>
           <w:tcPr>
-            <w:tcW w:type="dxa" w:w="2948"/>
+            <w:tcW w:type="dxa" w:w="3137"/>
             <w:vAlign w:val="center"/>
             <w:tcMar>
               <w:top w:w="80" w:type="dxa"/>
@@ -2221,13 +1390,13 @@
               <w:rPr>
                 <w:sz w:val="20"/>
               </w:rPr>
-              <w:t>変更有無は判定不能</w:t>
+              <w:t>審査と担当</w:t>
             </w:r>
           </w:p>
         </w:tc>
         <w:tc>
           <w:tcPr>
-            <w:tcW w:type="dxa" w:w="6463"/>
+            <w:tcW w:type="dxa" w:w="3137"/>
             <w:vAlign w:val="center"/>
             <w:tcMar>
               <w:top w:w="80" w:type="dxa"/>
@@ -2244,7 +1413,104 @@
               <w:rPr>
                 <w:sz w:val="20"/>
               </w:rPr>
-              <w:t>集計の完全性を確認できず、構成差も断定できません</w:t>
+              <w:t>担当</w:t>
+            </w:r>
+          </w:p>
+        </w:tc>
+        <w:tc>
+          <w:tcPr>
+            <w:tcW w:type="dxa" w:w="3137"/>
+            <w:vAlign w:val="center"/>
+            <w:tcMar>
+              <w:top w:w="80" w:type="dxa"/>
+              <w:left w:w="80" w:type="dxa"/>
+              <w:bottom w:w="80" w:type="dxa"/>
+              <w:right w:w="80" w:type="dxa"/>
+            </w:tcMar>
+          </w:tcPr>
+          <w:p>
+            <w:pPr>
+              <w:spacing w:after="40" w:before="40" w:line="276" w:lineRule="auto"/>
+            </w:pPr>
+            <w:r>
+              <w:rPr>
+                <w:sz w:val="20"/>
+              </w:rPr>
+              <w:t>確認・審査・承認</w:t>
+            </w:r>
+          </w:p>
+        </w:tc>
+      </w:tr>
+      <w:tr>
+        <w:trPr>
+          <w:cantSplit/>
+        </w:trPr>
+        <w:tc>
+          <w:tcPr>
+            <w:tcW w:type="dxa" w:w="3137"/>
+            <w:vAlign w:val="center"/>
+            <w:tcMar>
+              <w:top w:w="80" w:type="dxa"/>
+              <w:left w:w="80" w:type="dxa"/>
+              <w:bottom w:w="80" w:type="dxa"/>
+              <w:right w:w="80" w:type="dxa"/>
+            </w:tcMar>
+          </w:tcPr>
+          <w:p>
+            <w:pPr>
+              <w:spacing w:after="40" w:before="40" w:line="276" w:lineRule="auto"/>
+            </w:pPr>
+            <w:r>
+              <w:rPr>
+                <w:sz w:val="20"/>
+              </w:rPr>
+              <w:t>確認と担当</w:t>
+            </w:r>
+          </w:p>
+        </w:tc>
+        <w:tc>
+          <w:tcPr>
+            <w:tcW w:type="dxa" w:w="3137"/>
+            <w:vAlign w:val="center"/>
+            <w:tcMar>
+              <w:top w:w="80" w:type="dxa"/>
+              <w:left w:w="80" w:type="dxa"/>
+              <w:bottom w:w="80" w:type="dxa"/>
+              <w:right w:w="80" w:type="dxa"/>
+            </w:tcMar>
+          </w:tcPr>
+          <w:p>
+            <w:pPr>
+              <w:spacing w:after="40" w:before="40" w:line="276" w:lineRule="auto"/>
+            </w:pPr>
+            <w:r>
+              <w:rPr>
+                <w:sz w:val="20"/>
+              </w:rPr>
+              <w:t>担当</w:t>
+            </w:r>
+          </w:p>
+        </w:tc>
+        <w:tc>
+          <w:tcPr>
+            <w:tcW w:type="dxa" w:w="3137"/>
+            <w:vAlign w:val="center"/>
+            <w:tcMar>
+              <w:top w:w="80" w:type="dxa"/>
+              <w:left w:w="80" w:type="dxa"/>
+              <w:bottom w:w="80" w:type="dxa"/>
+              <w:right w:w="80" w:type="dxa"/>
+            </w:tcMar>
+          </w:tcPr>
+          <w:p>
+            <w:pPr>
+              <w:spacing w:after="40" w:before="40" w:line="276" w:lineRule="auto"/>
+            </w:pPr>
+            <w:r>
+              <w:rPr>
+                <w:sz w:val="20"/>
+              </w:rPr>
+              <w:t>確認・審査・承認</w:t>
             </w:r>
           </w:p>
         </w:tc>
@@ -2257,132 +1523,32 @@
     </w:p>
     <w:p>
       <w:r>
-        <w:t>注釈に記録された作成者名は、内容の同一性判定から除外し、参考情報としてグループごとに表示する。作成者名の変更だけでは不一致としない。作成者名は実際の操作ユーザーや最終編集者を証明する情報ではない。</w:t>
+        <w:t>PDF本体・レイヤーなし・上記4名称以外のレイヤーは、すべての比較で一致必須です。</w:t>
       </w:r>
     </w:p>
     <w:p>
       <w:r>
-        <w:t>例えば、注釈の文字・位置・色が同じで記録名だけが変わった場合、判定は「一致」のまま、双方の名前・件数と構成変更を表示します。フォントも変わった場合は「一致（フォントのみ変更）」と作成者構成変更が同時に表示されます。</w:t>
+        <w:t>一致必須の項目に不一致があればFAILです。不一致がなく、必要な項目を比較できなければUNVERIFIABLEです。必要な項目をすべて比較して一致していればPASSです。不一致と検証不能が混在する場合はFAILを優先し、検証不能の理由も残します。</w:t>
       </w:r>
     </w:p>
     <w:p>
       <w:r>
-        <w:t>同じ内容の注釈が複数ある場合、どの注釈を誰から誰へ変更したかは断定しません。構成が同じでも、個々の注釈の名前の付け替えがなかったことを証明するものではありません。</w:t>
+        <w:t>たとえば承認レイヤーだけが審査PDFと異なる場合、PDF全体は不一致でも、承認と審査の業務判定はPASSです。必須の担当レイヤーが両PDFにない場合は、一致確認ができないためUNVERIFIABLEとなります。</w:t>
       </w:r>
     </w:p>
     <w:p>
-      <w:bookmarkStart w:id="9" w:name="manual_ch_9"/>
+      <w:bookmarkStart w:id="6" w:name="manual_ch_6"/>
       <w:pPr>
         <w:pStyle w:val="Heading1"/>
       </w:pPr>
       <w:r>
-        <w:t>9. 結果を保存する</w:t>
+        <w:t>6 結果を保存する</w:t>
       </w:r>
-      <w:bookmarkEnd w:id="9"/>
+      <w:bookmarkEnd w:id="6"/>
     </w:p>
     <w:p>
       <w:r>
-        <w:t>比較後に「結果を保存」を押し、ファイルの種類と保存先を選びます。拡張子は.txt、.csv、.jsonを使ってください。保存先には既存のフォルダーを指定します。</w:t>
-      </w:r>
-    </w:p>
-    <w:p>
-      <w:pPr>
-        <w:keepNext/>
-        <w:keepLines/>
-        <w:jc w:val="center"/>
-      </w:pPr>
-      <w:r>
-        <w:drawing>
-          <wp:inline xmlns:a="http://schemas.openxmlformats.org/drawingml/2006/main" xmlns:pic="http://schemas.openxmlformats.org/drawingml/2006/picture">
-            <wp:extent cx="5976000" cy="792000"/>
-            <wp:docPr id="7" name="Picture 7" descr="結果保存ダイアログのファイル名と保存ボタン"/>
-            <wp:cNvGraphicFramePr>
-              <a:graphicFrameLocks noChangeAspect="1"/>
-            </wp:cNvGraphicFramePr>
-            <a:graphic>
-              <a:graphicData uri="http://schemas.openxmlformats.org/drawingml/2006/picture">
-                <pic:pic>
-                  <pic:nvPicPr>
-                    <pic:cNvPr id="0" name="save-results.png"/>
-                    <pic:cNvPicPr/>
-                  </pic:nvPicPr>
-                  <pic:blipFill>
-                    <a:blip r:embed="rId19"/>
-                    <a:stretch>
-                      <a:fillRect/>
-                    </a:stretch>
-                  </pic:blipFill>
-                  <pic:spPr>
-                    <a:xfrm>
-                      <a:off x="0" y="0"/>
-                      <a:ext cx="5976000" cy="792000"/>
-                    </a:xfrm>
-                    <a:prstGeom prst="rect"/>
-                  </pic:spPr>
-                </pic:pic>
-              </a:graphicData>
-            </a:graphic>
-          </wp:inline>
-        </w:drawing>
-      </w:r>
-    </w:p>
-    <w:p>
-      <w:pPr>
-        <w:pStyle w:val="Caption"/>
-        <w:keepLines/>
-      </w:pPr>
-      <w:r>
-        <w:t>図7 保存ダイアログの下部：ファイル名と種類を指定し、「保存」を押します。この例の保存先は説明用サンプルのフォルダーです。</w:t>
-      </w:r>
-    </w:p>
-    <w:p>
-      <w:pPr>
-        <w:keepNext/>
-        <w:keepLines/>
-        <w:jc w:val="center"/>
-      </w:pPr>
-      <w:r>
-        <w:drawing>
-          <wp:inline xmlns:a="http://schemas.openxmlformats.org/drawingml/2006/main" xmlns:pic="http://schemas.openxmlformats.org/drawingml/2006/picture">
-            <wp:extent cx="5220000" cy="688750"/>
-            <wp:docPr id="8" name="Picture 8" descr="保存形式の選択肢"/>
-            <wp:cNvGraphicFramePr>
-              <a:graphicFrameLocks noChangeAspect="1"/>
-            </wp:cNvGraphicFramePr>
-            <a:graphic>
-              <a:graphicData uri="http://schemas.openxmlformats.org/drawingml/2006/picture">
-                <pic:pic>
-                  <pic:nvPicPr>
-                    <pic:cNvPr id="0" name="save-formats.png"/>
-                    <pic:cNvPicPr/>
-                  </pic:nvPicPr>
-                  <pic:blipFill>
-                    <a:blip r:embed="rId20"/>
-                    <a:stretch>
-                      <a:fillRect/>
-                    </a:stretch>
-                  </pic:blipFill>
-                  <pic:spPr>
-                    <a:xfrm>
-                      <a:off x="0" y="0"/>
-                      <a:ext cx="5220000" cy="688750"/>
-                    </a:xfrm>
-                    <a:prstGeom prst="rect"/>
-                  </pic:spPr>
-                </pic:pic>
-              </a:graphicData>
-            </a:graphic>
-          </wp:inline>
-        </w:drawing>
-      </w:r>
-    </w:p>
-    <w:p>
-      <w:pPr>
-        <w:pStyle w:val="Caption"/>
-        <w:keepLines/>
-      </w:pPr>
-      <w:r>
-        <w:t>図8 ファイルの種類の部分拡大：テキスト（.txt）、CSV（.csv）、JSON（.json）を選べます。いずれも同じ比較結果を保存します。</w:t>
+        <w:t>画面右側の保存形式でTXTまたはPDFを選び、「結果を保存」を押します。保存先を選んで確定してください。既定名はcmp.txt、cmp.pdfです。既存の入力以外の出力を指定すると置き換えるため、過去の結果を残す場合は保存先を変更してください。</w:t>
       </w:r>
     </w:p>
     <w:tbl>
@@ -2454,7 +1620,7 @@
                 <w:b/>
                 <w:sz w:val="20"/>
               </w:rPr>
-              <w:t>主な用途</w:t>
+              <w:t>内容</w:t>
             </w:r>
           </w:p>
         </w:tc>
@@ -2505,7 +1671,58 @@
               <w:rPr>
                 <w:sz w:val="20"/>
               </w:rPr>
-              <w:t>テキストエディターで読む記録です。画面詳細と同じ判定・理由・作成者情報を含みます</w:t>
+              <w:t>UTF-8の比較表、全組合せ、理由、作成者参考情報</w:t>
+            </w:r>
+          </w:p>
+        </w:tc>
+      </w:tr>
+      <w:tr>
+        <w:trPr>
+          <w:cantSplit/>
+        </w:trPr>
+        <w:tc>
+          <w:tcPr>
+            <w:tcW w:type="dxa" w:w="2948"/>
+            <w:vAlign w:val="center"/>
+            <w:tcMar>
+              <w:top w:w="80" w:type="dxa"/>
+              <w:left w:w="80" w:type="dxa"/>
+              <w:bottom w:w="80" w:type="dxa"/>
+              <w:right w:w="80" w:type="dxa"/>
+            </w:tcMar>
+          </w:tcPr>
+          <w:p>
+            <w:pPr>
+              <w:spacing w:after="40" w:before="40" w:line="276" w:lineRule="auto"/>
+            </w:pPr>
+            <w:r>
+              <w:rPr>
+                <w:sz w:val="20"/>
+              </w:rPr>
+              <w:t>PDF</w:t>
+            </w:r>
+          </w:p>
+        </w:tc>
+        <w:tc>
+          <w:tcPr>
+            <w:tcW w:type="dxa" w:w="6463"/>
+            <w:vAlign w:val="center"/>
+            <w:tcMar>
+              <w:top w:w="80" w:type="dxa"/>
+              <w:left w:w="80" w:type="dxa"/>
+              <w:bottom w:w="80" w:type="dxa"/>
+              <w:right w:w="80" w:type="dxa"/>
+            </w:tcMar>
+          </w:tcPr>
+          <w:p>
+            <w:pPr>
+              <w:spacing w:after="40" w:before="40" w:line="276" w:lineRule="auto"/>
+            </w:pPr>
+            <w:r>
+              <w:rPr>
+                <w:sz w:val="20"/>
+              </w:rPr>
+              <w:t>日本語フォントを埋め込んだ表形式。改ページ時は表見出しを繰り返す</w:t>
             </w:r>
           </w:p>
         </w:tc>
@@ -2556,7 +1773,7 @@
               <w:rPr>
                 <w:sz w:val="20"/>
               </w:rPr>
-              <w:t>表計算ソフト等で一覧を整理するための形式です。1グループ1行で、作成者一覧はセル内に入ります</w:t>
+              <w:t>ファイル情報・主表・全組合せ・明細の複数セクション。UTF-8 BOM付き</w:t>
             </w:r>
           </w:p>
         </w:tc>
@@ -2607,7 +1824,7 @@
               <w:rPr>
                 <w:sz w:val="20"/>
               </w:rPr>
-              <w:t>別のプログラムで、判定や名前別件数を読み取るための形式です。利用にプログラミングは必須ではありません</w:t>
+              <w:t>schema_version 4。役割、ファイル情報、組合せ、比較明細を構造化</w:t>
             </w:r>
           </w:p>
         </w:tc>
@@ -2620,585 +1837,128 @@
     </w:p>
     <w:p>
       <w:r>
-        <w:t>TXT/JSONはUTF-8、CSVはUTF-8 BOM付きです。表計算ソフトでCSVを開いて文字化けする場合は、UTF-8を指定して取り込んでください。画面に保存済みJSONを開く機能はありません。再確認はTXT/CSVを読むか、元PDFを再比較します。</w:t>
+        <w:t>各入力のフルパス、最終更新日時（UTC、タイムゾーン付き）、容量のバイト数、SHA-256の先頭12桁を保存します。ハッシュの表示例はabcdef-123456です。ハッシュは実際に解析したバイト列から計算し、内容の一致状況とは別に記録します。</w:t>
       </w:r>
     </w:p>
     <w:p>
       <w:r>
-        <w:t>入力PDFと同じファイルへの保存は拒否します。入力以外の既存ファイルは上書きされる場合があるため、新しいファイル名を指定してください。結果にはフルパス、注釈の一部、記録名が含まれます。保存・共有する範囲を確認してください。</w:t>
+        <w:t>入力PDFへの保存は拒否します。PDF生成に失敗した場合は既存出力を保持します。PDF出力の依存やフォントが不足している場合も、比較結果からTXTを保存できます。</w:t>
       </w:r>
     </w:p>
     <w:p>
-      <w:bookmarkStart w:id="10" w:name="manual_ch_10"/>
+      <w:bookmarkStart w:id="7" w:name="manual_ch_7"/>
       <w:pPr>
         <w:pStyle w:val="Heading1"/>
       </w:pPr>
       <w:r>
-        <w:t>10. 原本の扱い</w:t>
+        <w:t>7 コマンドラインを使う</w:t>
       </w:r>
-      <w:bookmarkEnd w:id="10"/>
+      <w:bookmarkEnd w:id="7"/>
     </w:p>
     <w:p>
       <w:r>
-        <w:t>比較処理は入力PDFを読み取るだけで、注釈や本文を変更しません。結果を入力PDFへ上書きする操作も拒否します。ただし、別の編集ソフトでの保存や編集を防ぐ機能ではありません。基準PDFと比較対象を取り違えないよう、一覧のパスと基準表示を確認してください。</w:t>
+        <w:t>担当と確認だけを比較する例です。出力先フォルダーは先に作成してください。</w:t>
+      </w:r>
+    </w:p>
+    <w:p>
+      <w:pPr>
+        <w:keepLines/>
+      </w:pPr>
+      <w:r>
+        <w:rPr>
+          <w:rFonts w:ascii="Consolas" w:hAnsi="Consolas"/>
+          <w:sz w:val="20"/>
+        </w:rPr>
+        <w:t>start.bat --cli "C:\PDF\担当.pdf" "C:\PDF\確認.pdf" --output "C:\結果\cmp.txt"</w:t>
       </w:r>
     </w:p>
     <w:p>
       <w:r>
-        <w:t>差の説明は最初の代表的な差であり、全変更箇所の一覧ではありません。判定後のPDF確認は、必要なページ・注釈を表示ソフトで開いて行います。本ツールがリンクやPDF内のスクリプトを実行することはありません。</w:t>
+        <w:t>審査を省略して承認を指定する場合は、役割別オプションを使います。</w:t>
       </w:r>
     </w:p>
     <w:p>
-      <w:bookmarkStart w:id="11" w:name="manual_ch_11"/>
+      <w:pPr>
+        <w:keepLines/>
+      </w:pPr>
+      <w:r>
+        <w:rPr>
+          <w:rFonts w:ascii="Consolas" w:hAnsi="Consolas"/>
+          <w:sz w:val="20"/>
+        </w:rPr>
+        <w:t>start.bat --cli --responsible "C:\PDF\担当.pdf" --confirmation "C:\PDF\確認.pdf" --approval "C:\PDF\承認.pdf" --output "C:\結果\cmp.pdf"</w:t>
+      </w:r>
+    </w:p>
+    <w:p>
+      <w:r>
+        <w:t>審査は--reviewで指定できます。位置引数は担当・確認・審査・承認の順です。3番目の位置引数は審査であり、承認ではありません。位置引数と役割別オプションは併用できません。</w:t>
+      </w:r>
+    </w:p>
+    <w:p>
+      <w:r>
+        <w:t>--jsonではJSONを標準出力へ表示します。終了コード0はコマンド処理の完了を意味し、PASSや全体一致を意味しません。自動処理ではerrorsとpairsのoverall・businessを確認してください。通常の環境・入力・ファイル解析・保存エラーは終了コード2です。</w:t>
+      </w:r>
+    </w:p>
+    <w:p>
+      <w:bookmarkStart w:id="8" w:name="manual_ch_8"/>
       <w:pPr>
         <w:pStyle w:val="Heading1"/>
       </w:pPr>
       <w:r>
-        <w:t>11. よくあるエラーと対処</w:t>
+        <w:t>8 エラーや判定不能への対処</w:t>
       </w:r>
-      <w:bookmarkEnd w:id="11"/>
-    </w:p>
-    <w:tbl>
-      <w:tblPr>
-        <w:tblW w:type="auto" w:w="0"/>
-        <w:tblLayout w:type="fixed"/>
-        <w:tblLook w:firstColumn="1" w:firstRow="1" w:lastColumn="0" w:lastRow="0" w:noHBand="0" w:noVBand="1" w:val="04A0"/>
-        <w:tblBorders>
-          <w:top w:val="single" w:sz="4" w:color="D9D9D9"/>
-          <w:left w:val="single" w:sz="4" w:color="D9D9D9"/>
-          <w:bottom w:val="single" w:sz="4" w:color="D9D9D9"/>
-          <w:right w:val="single" w:sz="4" w:color="D9D9D9"/>
-          <w:insideH w:val="single" w:sz="4" w:color="D9D9D9"/>
-          <w:insideV w:val="single" w:sz="4" w:color="D9D9D9"/>
-        </w:tblBorders>
-      </w:tblPr>
-      <w:tblGrid>
-        <w:gridCol w:w="2948"/>
-        <w:gridCol w:w="6463"/>
-      </w:tblGrid>
-      <w:tr>
-        <w:trPr>
-          <w:cantSplit/>
-          <w:tblHeader/>
-        </w:trPr>
-        <w:tc>
-          <w:tcPr>
-            <w:tcW w:type="dxa" w:w="2948"/>
-            <w:vAlign w:val="center"/>
-            <w:tcMar>
-              <w:top w:w="80" w:type="dxa"/>
-              <w:left w:w="80" w:type="dxa"/>
-              <w:bottom w:w="80" w:type="dxa"/>
-              <w:right w:w="80" w:type="dxa"/>
-            </w:tcMar>
-            <w:shd w:fill="E8EFF6"/>
-          </w:tcPr>
-          <w:p>
-            <w:pPr>
-              <w:spacing w:after="40" w:before="40" w:line="276" w:lineRule="auto"/>
-            </w:pPr>
-            <w:r>
-              <w:rPr>
-                <w:b/>
-                <w:sz w:val="20"/>
-              </w:rPr>
-              <w:t>状況</w:t>
-            </w:r>
-          </w:p>
-        </w:tc>
-        <w:tc>
-          <w:tcPr>
-            <w:tcW w:type="dxa" w:w="6463"/>
-            <w:vAlign w:val="center"/>
-            <w:tcMar>
-              <w:top w:w="80" w:type="dxa"/>
-              <w:left w:w="80" w:type="dxa"/>
-              <w:bottom w:w="80" w:type="dxa"/>
-              <w:right w:w="80" w:type="dxa"/>
-            </w:tcMar>
-            <w:shd w:fill="E8EFF6"/>
-          </w:tcPr>
-          <w:p>
-            <w:pPr>
-              <w:spacing w:after="40" w:before="40" w:line="276" w:lineRule="auto"/>
-            </w:pPr>
-            <w:r>
-              <w:rPr>
-                <w:b/>
-                <w:sz w:val="20"/>
-              </w:rPr>
-              <w:t>対処</w:t>
-            </w:r>
-          </w:p>
-        </w:tc>
-      </w:tr>
-      <w:tr>
-        <w:trPr>
-          <w:cantSplit/>
-        </w:trPr>
-        <w:tc>
-          <w:tcPr>
-            <w:tcW w:type="dxa" w:w="2948"/>
-            <w:vAlign w:val="center"/>
-            <w:tcMar>
-              <w:top w:w="80" w:type="dxa"/>
-              <w:left w:w="80" w:type="dxa"/>
-              <w:bottom w:w="80" w:type="dxa"/>
-              <w:right w:w="80" w:type="dxa"/>
-            </w:tcMar>
-          </w:tcPr>
-          <w:p>
-            <w:pPr>
-              <w:spacing w:after="40" w:before="40" w:line="276" w:lineRule="auto"/>
-            </w:pPr>
-            <w:r>
-              <w:rPr>
-                <w:sz w:val="20"/>
-              </w:rPr>
-              <w:t>Python 3.14が見つからない</w:t>
-            </w:r>
-          </w:p>
-        </w:tc>
-        <w:tc>
-          <w:tcPr>
-            <w:tcW w:type="dxa" w:w="6463"/>
-            <w:vAlign w:val="center"/>
-            <w:tcMar>
-              <w:top w:w="80" w:type="dxa"/>
-              <w:left w:w="80" w:type="dxa"/>
-              <w:bottom w:w="80" w:type="dxa"/>
-              <w:right w:w="80" w:type="dxa"/>
-            </w:tcMar>
-          </w:tcPr>
-          <w:p>
-            <w:pPr>
-              <w:spacing w:after="40" w:before="40" w:line="276" w:lineRule="auto"/>
-            </w:pPr>
-            <w:hyperlink r:id="rId21">
-              <w:r>
-                <w:rPr>
-                  <w:color w:val="1F4E79"/>
-                  <w:u w:val="single"/>
-                </w:rPr>
-                <w:t>Pythonの指定</w:t>
-              </w:r>
-            </w:hyperlink>
-            <w:r>
-              <w:rPr>
-                <w:sz w:val="20"/>
-              </w:rPr>
-              <w:t>に従い通常インストール済みPythonの場所を確認します</w:t>
-            </w:r>
-          </w:p>
-        </w:tc>
-      </w:tr>
-      <w:tr>
-        <w:trPr>
-          <w:cantSplit/>
-        </w:trPr>
-        <w:tc>
-          <w:tcPr>
-            <w:tcW w:type="dxa" w:w="2948"/>
-            <w:vAlign w:val="center"/>
-            <w:tcMar>
-              <w:top w:w="80" w:type="dxa"/>
-              <w:left w:w="80" w:type="dxa"/>
-              <w:bottom w:w="80" w:type="dxa"/>
-              <w:right w:w="80" w:type="dxa"/>
-            </w:tcMar>
-          </w:tcPr>
-          <w:p>
-            <w:pPr>
-              <w:spacing w:after="40" w:before="40" w:line="276" w:lineRule="auto"/>
-            </w:pPr>
-            <w:r>
-              <w:rPr>
-                <w:sz w:val="20"/>
-              </w:rPr>
-              <w:t>pypdfのソースが見つからない・版が違う</w:t>
-            </w:r>
-          </w:p>
-        </w:tc>
-        <w:tc>
-          <w:tcPr>
-            <w:tcW w:type="dxa" w:w="6463"/>
-            <w:vAlign w:val="center"/>
-            <w:tcMar>
-              <w:top w:w="80" w:type="dxa"/>
-              <w:left w:w="80" w:type="dxa"/>
-              <w:bottom w:w="80" w:type="dxa"/>
-              <w:right w:w="80" w:type="dxa"/>
-            </w:tcMar>
-          </w:tcPr>
-          <w:p>
-            <w:pPr>
-              <w:spacing w:after="40" w:before="40" w:line="276" w:lineRule="auto"/>
-            </w:pPr>
-            <w:hyperlink r:id="rId22">
-              <w:r>
-                <w:rPr>
-                  <w:color w:val="1F4E79"/>
-                  <w:u w:val="single"/>
-                </w:rPr>
-                <w:t>手動配置</w:t>
-              </w:r>
-            </w:hyperlink>
-            <w:r>
-              <w:rPr>
-                <w:sz w:val="20"/>
-              </w:rPr>
-              <w:t>を確認し、内側のpypdfフォルダー全体を6.20.1で配置します</w:t>
-            </w:r>
-          </w:p>
-        </w:tc>
-      </w:tr>
-      <w:tr>
-        <w:trPr>
-          <w:cantSplit/>
-        </w:trPr>
-        <w:tc>
-          <w:tcPr>
-            <w:tcW w:type="dxa" w:w="2948"/>
-            <w:vAlign w:val="center"/>
-            <w:tcMar>
-              <w:top w:w="80" w:type="dxa"/>
-              <w:left w:w="80" w:type="dxa"/>
-              <w:bottom w:w="80" w:type="dxa"/>
-              <w:right w:w="80" w:type="dxa"/>
-            </w:tcMar>
-          </w:tcPr>
-          <w:p>
-            <w:pPr>
-              <w:spacing w:after="40" w:before="40" w:line="276" w:lineRule="auto"/>
-            </w:pPr>
-            <w:r>
-              <w:rPr>
-                <w:sz w:val="20"/>
-              </w:rPr>
-              <w:t>PDFを追加できない</w:t>
-            </w:r>
-          </w:p>
-        </w:tc>
-        <w:tc>
-          <w:tcPr>
-            <w:tcW w:type="dxa" w:w="6463"/>
-            <w:vAlign w:val="center"/>
-            <w:tcMar>
-              <w:top w:w="80" w:type="dxa"/>
-              <w:left w:w="80" w:type="dxa"/>
-              <w:bottom w:w="80" w:type="dxa"/>
-              <w:right w:w="80" w:type="dxa"/>
-            </w:tcMar>
-          </w:tcPr>
-          <w:p>
-            <w:pPr>
-              <w:spacing w:after="40" w:before="40" w:line="276" w:lineRule="auto"/>
-            </w:pPr>
-            <w:r>
-              <w:rPr>
-                <w:sz w:val="20"/>
-              </w:rPr>
-              <w:t>合計4個以内、拡張子.pdf、存在するファイルであることを確認します</w:t>
-            </w:r>
-          </w:p>
-        </w:tc>
-      </w:tr>
-      <w:tr>
-        <w:trPr>
-          <w:cantSplit/>
-        </w:trPr>
-        <w:tc>
-          <w:tcPr>
-            <w:tcW w:type="dxa" w:w="2948"/>
-            <w:vAlign w:val="center"/>
-            <w:tcMar>
-              <w:top w:w="80" w:type="dxa"/>
-              <w:left w:w="80" w:type="dxa"/>
-              <w:bottom w:w="80" w:type="dxa"/>
-              <w:right w:w="80" w:type="dxa"/>
-            </w:tcMar>
-          </w:tcPr>
-          <w:p>
-            <w:pPr>
-              <w:spacing w:after="40" w:before="40" w:line="276" w:lineRule="auto"/>
-            </w:pPr>
-            <w:r>
-              <w:rPr>
-                <w:sz w:val="20"/>
-              </w:rPr>
-              <w:t>PDFを追加できたが解析できない</w:t>
-            </w:r>
-          </w:p>
-        </w:tc>
-        <w:tc>
-          <w:tcPr>
-            <w:tcW w:type="dxa" w:w="6463"/>
-            <w:vAlign w:val="center"/>
-            <w:tcMar>
-              <w:top w:w="80" w:type="dxa"/>
-              <w:left w:w="80" w:type="dxa"/>
-              <w:bottom w:w="80" w:type="dxa"/>
-              <w:right w:w="80" w:type="dxa"/>
-            </w:tcMar>
-          </w:tcPr>
-          <w:p>
-            <w:pPr>
-              <w:spacing w:after="40" w:before="40" w:line="276" w:lineRule="auto"/>
-            </w:pPr>
-            <w:r>
-              <w:rPr>
-                <w:sz w:val="20"/>
-              </w:rPr>
-              <w:t>ファイルの内容、破損・暗号化・対応範囲と詳細理由を確認します。追加時にはPDF全体を解析しません</w:t>
-            </w:r>
-          </w:p>
-        </w:tc>
-      </w:tr>
-      <w:tr>
-        <w:trPr>
-          <w:cantSplit/>
-        </w:trPr>
-        <w:tc>
-          <w:tcPr>
-            <w:tcW w:type="dxa" w:w="2948"/>
-            <w:vAlign w:val="center"/>
-            <w:tcMar>
-              <w:top w:w="80" w:type="dxa"/>
-              <w:left w:w="80" w:type="dxa"/>
-              <w:bottom w:w="80" w:type="dxa"/>
-              <w:right w:w="80" w:type="dxa"/>
-            </w:tcMar>
-          </w:tcPr>
-          <w:p>
-            <w:pPr>
-              <w:spacing w:after="40" w:before="40" w:line="276" w:lineRule="auto"/>
-            </w:pPr>
-            <w:r>
-              <w:rPr>
-                <w:sz w:val="20"/>
-              </w:rPr>
-              <w:t>比較開始時に入力エラー</w:t>
-            </w:r>
-          </w:p>
-        </w:tc>
-        <w:tc>
-          <w:tcPr>
-            <w:tcW w:type="dxa" w:w="6463"/>
-            <w:vAlign w:val="center"/>
-            <w:tcMar>
-              <w:top w:w="80" w:type="dxa"/>
-              <w:left w:w="80" w:type="dxa"/>
-              <w:bottom w:w="80" w:type="dxa"/>
-              <w:right w:w="80" w:type="dxa"/>
-            </w:tcMar>
-          </w:tcPr>
-          <w:p>
-            <w:pPr>
-              <w:spacing w:after="40" w:before="40" w:line="276" w:lineRule="auto"/>
-            </w:pPr>
-            <w:r>
-              <w:rPr>
-                <w:sz w:val="20"/>
-              </w:rPr>
-              <w:t>PDFを2～4個指定します</w:t>
-            </w:r>
-          </w:p>
-        </w:tc>
-      </w:tr>
-      <w:tr>
-        <w:trPr>
-          <w:cantSplit/>
-        </w:trPr>
-        <w:tc>
-          <w:tcPr>
-            <w:tcW w:type="dxa" w:w="2948"/>
-            <w:vAlign w:val="center"/>
-            <w:tcMar>
-              <w:top w:w="80" w:type="dxa"/>
-              <w:left w:w="80" w:type="dxa"/>
-              <w:bottom w:w="80" w:type="dxa"/>
-              <w:right w:w="80" w:type="dxa"/>
-            </w:tcMar>
-          </w:tcPr>
-          <w:p>
-            <w:pPr>
-              <w:spacing w:after="40" w:before="40" w:line="276" w:lineRule="auto"/>
-            </w:pPr>
-            <w:r>
-              <w:rPr>
-                <w:sz w:val="20"/>
-              </w:rPr>
-              <w:t>時間超過・処理失敗</w:t>
-            </w:r>
-          </w:p>
-        </w:tc>
-        <w:tc>
-          <w:tcPr>
-            <w:tcW w:type="dxa" w:w="6463"/>
-            <w:vAlign w:val="center"/>
-            <w:tcMar>
-              <w:top w:w="80" w:type="dxa"/>
-              <w:left w:w="80" w:type="dxa"/>
-              <w:bottom w:w="80" w:type="dxa"/>
-              <w:right w:w="80" w:type="dxa"/>
-            </w:tcMar>
-          </w:tcPr>
-          <w:p>
-            <w:pPr>
-              <w:spacing w:after="40" w:before="40" w:line="276" w:lineRule="auto"/>
-            </w:pPr>
-            <w:r>
-              <w:rPr>
-                <w:sz w:val="20"/>
-              </w:rPr>
-              <w:t>詳細を記録します。比較対象数を減らす場合は基準を維持します。大規模・未対応構造では完了しないことがあります</w:t>
-            </w:r>
-          </w:p>
-        </w:tc>
-      </w:tr>
-      <w:tr>
-        <w:trPr>
-          <w:cantSplit/>
-        </w:trPr>
-        <w:tc>
-          <w:tcPr>
-            <w:tcW w:type="dxa" w:w="2948"/>
-            <w:vAlign w:val="center"/>
-            <w:tcMar>
-              <w:top w:w="80" w:type="dxa"/>
-              <w:left w:w="80" w:type="dxa"/>
-              <w:bottom w:w="80" w:type="dxa"/>
-              <w:right w:w="80" w:type="dxa"/>
-            </w:tcMar>
-          </w:tcPr>
-          <w:p>
-            <w:pPr>
-              <w:spacing w:after="40" w:before="40" w:line="276" w:lineRule="auto"/>
-            </w:pPr>
-            <w:r>
-              <w:rPr>
-                <w:sz w:val="20"/>
-              </w:rPr>
-              <w:t>保存エラー</w:t>
-            </w:r>
-          </w:p>
-        </w:tc>
-        <w:tc>
-          <w:tcPr>
-            <w:tcW w:type="dxa" w:w="6463"/>
-            <w:vAlign w:val="center"/>
-            <w:tcMar>
-              <w:top w:w="80" w:type="dxa"/>
-              <w:left w:w="80" w:type="dxa"/>
-              <w:bottom w:w="80" w:type="dxa"/>
-              <w:right w:w="80" w:type="dxa"/>
-            </w:tcMar>
-          </w:tcPr>
-          <w:p>
-            <w:pPr>
-              <w:spacing w:after="40" w:before="40" w:line="276" w:lineRule="auto"/>
-            </w:pPr>
-            <w:r>
-              <w:rPr>
-                <w:sz w:val="20"/>
-              </w:rPr>
-              <w:t>拡張子、保存先フォルダーの存在・書き込み権限、入力ファイルと同一でないことを確認します</w:t>
-            </w:r>
-          </w:p>
-        </w:tc>
-      </w:tr>
-    </w:tbl>
-    <w:p>
-      <w:pPr>
-        <w:spacing w:after="40"/>
-      </w:pPr>
+      <w:bookmarkEnd w:id="8"/>
     </w:p>
     <w:p>
-      <w:bookmarkStart w:id="12" w:name="manual_ch_12"/>
+      <w:r>
+        <w:t>担当・確認が未指定なら指定してください。暗号化PDF、壊れたPDF、未対応構造は検証不能となります。同名レイヤーが重複する場合も、その名前を安全に対応付けできません。詳細に表示された理由を確認してください。</w:t>
+      </w:r>
+    </w:p>
+    <w:p>
+      <w:r>
+        <w:t>読み込み中のファイル変更を検出した場合は、PDFを保存し終えてから再比較してください。読めなかったファイルやサイズ上限超過の場合はハッシュを取得不能と表示します。壊れたPDFでも全バイトを読めた場合は、そのハッシュを記録します。</w:t>
+      </w:r>
+    </w:p>
+    <w:p>
+      <w:r>
+        <w:t>旧schema_version 2・3の保存結果は、新しい業務判定を証明するものではありません。元PDFを指定して再比較してください。現在のGUIに保存JSONを開く操作はありません。</w:t>
+      </w:r>
+    </w:p>
+    <w:p>
+      <w:bookmarkStart w:id="9" w:name="manual_ch_9"/>
       <w:pPr>
         <w:pStyle w:val="Heading1"/>
       </w:pPr>
       <w:r>
-        <w:t>12. よくある質問</w:t>
+        <w:t>9 比較の範囲と参考情報</w:t>
       </w:r>
-      <w:bookmarkEnd w:id="12"/>
+      <w:bookmarkEnd w:id="9"/>
     </w:p>
     <w:p>
       <w:r>
-        <w:rPr>
-          <w:b/>
-        </w:rPr>
-        <w:t>一致なら目視確認は不要ですか。</w:t>
+        <w:t>1ファイル128 MiB以下、1～2000ページを対象とし、未対応のPDF構造は検証不能とします。対応範囲の詳細は</w:t>
       </w:r>
-      <w:r>
-        <w:t xml:space="preserve"> 必要です。重なりによる遮蔽、見やすさ、記入内容の正しさは判定しません。</w:t>
-      </w:r>
-    </w:p>
-    <w:p>
-      <w:r>
-        <w:rPr>
-          <w:b/>
-        </w:rPr>
-        <w:t>同じ見た目なのに不一致になるのはなぜですか。</w:t>
-      </w:r>
-      <w:r>
-        <w:t xml:space="preserve"> 画像の画素比較ではなく構造を比較するためです。等価な別命令や複合単位内部の並び替え等が差として残る場合があります。</w:t>
-      </w:r>
-    </w:p>
-    <w:p>
-      <w:r>
-        <w:rPr>
-          <w:b/>
-        </w:rPr>
-        <w:t>作成者名で実際の操作者が分かりますか。</w:t>
-      </w:r>
-      <w:r>
-        <w:t xml:space="preserve"> 分かりません。既存注釈を別の人が編集しても、元の記録名が残る場合があります。</w:t>
-      </w:r>
-    </w:p>
-    <w:p>
-      <w:r>
-        <w:rPr>
-          <w:b/>
-        </w:rPr>
-        <w:t>DEMOスタンプを無視できますか。</w:t>
-      </w:r>
-      <w:r>
-        <w:t xml:space="preserve"> 特別に除外しません。追加された内容は通常のレイヤーなしの差として検出します。</w:t>
-      </w:r>
-    </w:p>
-    <w:p>
-      <w:r>
-        <w:rPr>
-          <w:b/>
-        </w:rPr>
-        <w:t>基準PDFそのものの正しさも検査しますか。</w:t>
-      </w:r>
-      <w:r>
-        <w:t xml:space="preserve"> 検査しません。すべての入力に同じ変更がある場合も、基準との差だけでは分かりません。</w:t>
-      </w:r>
-    </w:p>
-    <w:p>
-      <w:r>
-        <w:rPr>
-          <w:b/>
-        </w:rPr>
-        <w:t>コマンドで実行できますか。</w:t>
-      </w:r>
-      <w:r>
-        <w:t xml:space="preserve"> はい。引数例と終了コードの注意は</w:t>
-      </w:r>
-      <w:hyperlink r:id="rId23">
+      <w:hyperlink r:id="rId11">
         <w:r>
           <w:rPr>
             <w:color w:val="1F4E79"/>
             <w:u w:val="single"/>
           </w:rPr>
-          <w:t>インストール手順のCLI</w:t>
+          <w:t>対応構造一覧</w:t>
         </w:r>
       </w:hyperlink>
       <w:r>
         <w:t>を参照してください。</w:t>
+      </w:r>
+    </w:p>
+    <w:p>
+      <w:r>
+        <w:t>注釈の作成者名はPDFに記録された値を集計した参考情報です。実際の操作者・最終編集者を証明しません。作成者名だけの変更は内容不一致にせず、名前別件数・未設定件数・構成変更として表示します。集計未完了と注釈なしは区別します。</w:t>
+      </w:r>
+    </w:p>
+    <w:p>
+      <w:r>
+        <w:t>比較結果は、文字の遮蔽や重なり、見た目の完全一致、記載内容の妥当性を保証するものではありません。業務判定に加え、必要な目視確認を行ってください。</w:t>
       </w:r>
     </w:p>
     <w:bookmarkEnd w:id="900"/>
@@ -3431,19 +2191,6 @@
   </w:num>
   <w:num w:numId="9">
     <w:abstractNumId w:val="0"/>
-  </w:num>
-  <w:abstractNum w:abstractNumId="9">
-    <w:lvl w:ilvl="0">
-      <w:start w:val="1"/>
-      <w:numFmt w:val="decimal"/>
-      <w:lvlText w:val="%1."/>
-      <w:pPr>
-        <w:ind w:left="360" w:hanging="260"/>
-      </w:pPr>
-    </w:lvl>
-  </w:abstractNum>
-  <w:num w:numId="10">
-    <w:abstractNumId w:val="9"/>
   </w:num>
 </w:numbering>
 </file>

</xml_diff>